<commit_message>
Add language locking and align language button styling
</commit_message>
<xml_diff>
--- a/会记_产品介绍.docx
+++ b/会记_产品介绍.docx
@@ -436,47 +436,10 @@
       </w:r>
       <w:r>
         <w:rPr>
-          <w:b/>
-          <w:color w:val="0F766E"/>
-          <w:sz w:val="20"/>
-          <w:lang w:eastAsia="zh-CN"/>
-        </w:rPr>
-        <w:t xml:space="preserve">  </w:t>
-      </w:r>
-      <w:r>
-        <w:rPr>
           <w:sz w:val="21"/>
           <w:lang w:eastAsia="zh-CN"/>
         </w:rPr>
-        <w:t>一套本地优先的实时会议系统：录音中提供低延迟多语言转写；停录后自动完成高精度</w:t>
-      </w:r>
-      <w:r>
-        <w:rPr>
-          <w:sz w:val="21"/>
-          <w:lang w:eastAsia="zh-CN"/>
-        </w:rPr>
-        <w:t xml:space="preserve"> ASR </w:t>
-      </w:r>
-      <w:r>
-        <w:rPr>
-          <w:sz w:val="21"/>
-          <w:lang w:eastAsia="zh-CN"/>
-        </w:rPr>
-        <w:t>精修、说话人重排和最终翻译，完成后由用户点击按钮生成纪要，并自动生成</w:t>
-      </w:r>
-      <w:r>
-        <w:rPr>
-          <w:sz w:val="21"/>
-          <w:lang w:eastAsia="zh-CN"/>
-        </w:rPr>
-        <w:t xml:space="preserve"> To-do-list</w:t>
-      </w:r>
-      <w:r>
-        <w:rPr>
-          <w:sz w:val="21"/>
-          <w:lang w:eastAsia="zh-CN"/>
-        </w:rPr>
-        <w:t>。录音保存与后台后处理相互独立，任何后处理失败都不影响已保存的音频和快速转写。</w:t>
+        <w:t xml:space="preserve">  一套本地优先的实时会议系统：录音中提供低延迟多语言转写和流式草稿；停录后自动完成高精度 ASR 精修、说话人重排和最终翻译，完成后由用户点击按钮生成纪要，并自动生成 To-do-list。前端以浅色 AI 工作台呈现会议历史、录音控制、实时逐句稿、纪要、To-do-list 和文件下载；会议级参数支持普通/高级分级、滑块与数字输入联动以及预设模板。录音保存与后台后处理相互独立，任何后处理失败都不影响已保存的音频和快速转写。</w:t>
       </w:r>
     </w:p>
     <w:p>
@@ -1296,113 +1259,7 @@
         <w:rPr>
           <w:lang w:eastAsia="zh-CN"/>
         </w:rPr>
-        <w:t>实时链路统一使用</w:t>
-      </w:r>
-      <w:r>
-        <w:rPr>
-          <w:lang w:eastAsia="zh-CN"/>
-        </w:rPr>
-        <w:t xml:space="preserve"> large-v3-turbo</w:t>
-      </w:r>
-      <w:r>
-        <w:rPr>
-          <w:lang w:eastAsia="zh-CN"/>
-        </w:rPr>
-        <w:t>，默认 beam_size=5、best_of=5；实时短片段会复用上一句语言先验和最近最多 3 句上下文（最多 500 字符），遇到低质量结果时清除这些先验并自动重试，降低模型切换和隐式回退带来的不确定性。浏览器通过</w:t>
-      </w:r>
-      <w:r>
-        <w:rPr>
-          <w:lang w:eastAsia="zh-CN"/>
-        </w:rPr>
-        <w:t xml:space="preserve"> </w:t>
-      </w:r>
-      <w:proofErr w:type="spellStart"/>
-      <w:r>
-        <w:rPr>
-          <w:lang w:eastAsia="zh-CN"/>
-        </w:rPr>
-        <w:t>AudioWorklet</w:t>
-      </w:r>
-      <w:proofErr w:type="spellEnd"/>
-      <w:r>
-        <w:rPr>
-          <w:lang w:eastAsia="zh-CN"/>
-        </w:rPr>
-        <w:t xml:space="preserve"> </w:t>
-      </w:r>
-      <w:r>
-        <w:rPr>
-          <w:lang w:eastAsia="zh-CN"/>
-        </w:rPr>
-        <w:t>采集</w:t>
-      </w:r>
-      <w:r>
-        <w:rPr>
-          <w:lang w:eastAsia="zh-CN"/>
-        </w:rPr>
-        <w:t xml:space="preserve"> 16 kHz</w:t>
-      </w:r>
-      <w:r>
-        <w:rPr>
-          <w:lang w:eastAsia="zh-CN"/>
-        </w:rPr>
-        <w:t>、单声道</w:t>
-      </w:r>
-      <w:r>
-        <w:rPr>
-          <w:lang w:eastAsia="zh-CN"/>
-        </w:rPr>
-        <w:t xml:space="preserve"> PCM16 </w:t>
-      </w:r>
-      <w:r>
-        <w:rPr>
-          <w:lang w:eastAsia="zh-CN"/>
-        </w:rPr>
-        <w:t>音频，</w:t>
-      </w:r>
-      <w:proofErr w:type="spellStart"/>
-      <w:r>
-        <w:rPr>
-          <w:lang w:eastAsia="zh-CN"/>
-        </w:rPr>
-        <w:t>FastAPI</w:t>
-      </w:r>
-      <w:proofErr w:type="spellEnd"/>
-      <w:r>
-        <w:rPr>
-          <w:lang w:eastAsia="zh-CN"/>
-        </w:rPr>
-        <w:t xml:space="preserve"> WebSocket </w:t>
-      </w:r>
-      <w:r>
-        <w:rPr>
-          <w:lang w:eastAsia="zh-CN"/>
-        </w:rPr>
-        <w:t>接收并将</w:t>
-      </w:r>
-      <w:r>
-        <w:rPr>
-          <w:lang w:eastAsia="zh-CN"/>
-        </w:rPr>
-        <w:t xml:space="preserve"> partial/final </w:t>
-      </w:r>
-      <w:r>
-        <w:rPr>
-          <w:lang w:eastAsia="zh-CN"/>
-        </w:rPr>
-        <w:t>结果推送到前端。中文原文直接显示，英文和德文进入本地</w:t>
-      </w:r>
-      <w:r>
-        <w:rPr>
-          <w:lang w:eastAsia="zh-CN"/>
-        </w:rPr>
-        <w:t xml:space="preserve"> OPUS-MT </w:t>
-      </w:r>
-      <w:r>
-        <w:rPr>
-          <w:lang w:eastAsia="zh-CN"/>
-        </w:rPr>
-        <w:t>翻译队列后批量补充简体中文。</w:t>
+        <w:t>实时链路统一使用 large-v3-turbo，默认 beam_size=5、best_of=5；实时短片段会复用上一句语言先验和最近最多 3 句上下文（最多 500 字符），遇到低质量结果时清除这些先验并自动重试，降低模型切换和隐式回退带来的不确定性。浏览器通过 AudioWorklet 采集 16 kHz、单声道 PCM16 音频，FastAPI WebSocket 接收并将 draft、partial/final 结果推送到前端。draft 采用服务端实际返回的完整快照持续替换识别中气泡，不模拟逐字打字；最终 utterance 生成后清理对应草稿。中文原文直接显示，英文和德文进入本地 OPUS-MT 翻译队列后在对应消息下方补充简体中文翻译。</w:t>
       </w:r>
     </w:p>
     <w:p>
@@ -2011,36 +1868,22 @@
     </w:p>
     <w:p>
       <w:pPr>
-        <w:pStyle w:val="1"/>
+        <w:pStyle w:val="21"/>
+        <w:rPr>
+          <w:lang w:eastAsia="zh-CN"/>
+        </w:rPr>
       </w:pPr>
       <w:r>
         <w:rPr>
           <w:rFonts w:ascii="Calibri" w:eastAsia="微软雅黑" w:hAnsi="Calibri" w:cs="微软雅黑"/>
-        </w:rPr>
-        <w:t xml:space="preserve">3. </w:t>
-      </w:r>
-      <w:r>
-        <w:rPr>
-          <w:rFonts w:ascii="Calibri" w:eastAsia="微软雅黑" w:hAnsi="Calibri" w:cs="微软雅黑"/>
-        </w:rPr>
-        <w:t>从一次会议到行动闭环</w:t>
+          <w:lang w:eastAsia="zh-CN"/>
+        </w:rPr>
+        <w:t>2.6 AI 工作台与用户参数控制</w:t>
       </w:r>
     </w:p>
     <w:p>
       <w:r>
-        <w:t>产品流程围绕</w:t>
-      </w:r>
-      <w:r>
-        <w:t>“</w:t>
-      </w:r>
-      <w:r>
-        <w:t>先保存、后完善</w:t>
-      </w:r>
-      <w:r>
-        <w:t>”</w:t>
-      </w:r>
-      <w:r>
-        <w:t>设计：</w:t>
+        <w:t>前端采用浅色 AI 工作台布局，保留会议历史、录音控制、实时逐句稿、后台处理、会议纪要、To-do-list、文件下载和设置入口等完整模块。中间区域是主要阅读焦点，右侧以轻量结果卡片呈现纪要和行动项，桌面端保持三栏结构，中等宽度和移动端按内容顺序降级为双列或单列。</w:t>
       </w:r>
     </w:p>
     <w:p>
@@ -2048,75 +1891,80 @@
         <w:pStyle w:val="a"/>
       </w:pPr>
       <w:r>
-        <w:t>会前预检：确认</w:t>
-      </w:r>
-      <w:r>
-        <w:t xml:space="preserve"> large-v3-turbo</w:t>
-      </w:r>
-      <w:r>
-        <w:t>、</w:t>
-      </w:r>
-      <w:r>
-        <w:t>large-v3</w:t>
-      </w:r>
-      <w:r>
-        <w:t>、</w:t>
-      </w:r>
-      <w:r>
-        <w:t>OPUS-MT</w:t>
-      </w:r>
-      <w:r>
-        <w:t>、</w:t>
-      </w:r>
-      <w:r>
-        <w:t xml:space="preserve">VAD </w:t>
-      </w:r>
-      <w:r>
-        <w:t>和</w:t>
-      </w:r>
-      <w:r>
-        <w:t xml:space="preserve"> Resemblyzer </w:t>
-      </w:r>
-      <w:r>
-        <w:t>权重已准备；未就绪时阻止新建会议。</w:t>
+        <w:t>实时逐句稿：服务端 draft 增量直接更新底部“正在识别”气泡；收到 utterance 后清理对应草稿并插入正式消息。每条消息保留说话人、时间和语言元信息，原文与中文翻译上下叠放；中文原文不重复显示翻译，英文和德文在 translation_update 到达后只更新对应翻译气泡。</w:t>
       </w:r>
     </w:p>
     <w:p>
       <w:pPr>
         <w:pStyle w:val="a"/>
-        <w:rPr>
-          <w:lang w:eastAsia="zh-CN"/>
-        </w:rPr>
       </w:pPr>
       <w:r>
-        <w:rPr>
-          <w:lang w:eastAsia="zh-CN"/>
-        </w:rPr>
-        <w:t>录音中：采集音频并按</w:t>
-      </w:r>
-      <w:r>
-        <w:rPr>
-          <w:lang w:eastAsia="zh-CN"/>
-        </w:rPr>
-        <w:t xml:space="preserve"> 30 </w:t>
-      </w:r>
-      <w:r>
-        <w:rPr>
-          <w:lang w:eastAsia="zh-CN"/>
-        </w:rPr>
-        <w:t>分钟滚动切片保存；实时</w:t>
-      </w:r>
-      <w:r>
-        <w:rPr>
-          <w:lang w:eastAsia="zh-CN"/>
-        </w:rPr>
-        <w:t xml:space="preserve"> ASR </w:t>
-      </w:r>
-      <w:r>
-        <w:rPr>
-          <w:lang w:eastAsia="zh-CN"/>
-        </w:rPr>
-        <w:t>输出转写，在线聚类提供匿名演讲人，翻译按批次异步补充。</w:t>
+        <w:t>会议成果流式化：会议纪要通过 summary_reset、summary_delta、summary_complete 和 summary_failed 事件持续更新；生成中显示状态和流式光标，完成后支持 Markdown 下载，失败时保留已提交内容并提供重试。To-do-list 继续支持重试和 JSON 下载，后台处理阶段条保持可见。</w:t>
+      </w:r>
+    </w:p>
+    <w:p>
+      <w:pPr>
+        <w:pStyle w:val="a"/>
+      </w:pPr>
+      <w:r>
+        <w:t>用户参数控制：设置分为普通设置和高级设置。普通设置覆盖输入设备、本地音量预览、背景声过滤、语音起始、前置缓冲、静音结束、最短语音、语音比例、最长连续语音和实时刷新间隔；高级设置覆盖录音分段、实时/会后 beam size、best_of、重试质量阈值、翻译解码和说话人聚类参数，并提供精修、后台处理、说话人重排和录音保留开关。滑块右侧数字输入框与滑块双向联动，带单位参数显式显示单位。</w:t>
+      </w:r>
+    </w:p>
+    <w:p>
+      <w:pPr>
+        <w:pStyle w:val="a"/>
+      </w:pPr>
+      <w:r>
+        <w:t>参数模板与边界：内置“均衡实时”“低延迟速记”“高质量会议”三套预设；选择模板会覆盖当前未保存参数，手动调整任一参数后自动标记为“自定义模板”。模板只覆盖当前会议的识别和处理参数，不覆盖模型名称、计算设备、模型下载策略或积墨纪要/To-do 接口等服务级配置。</w:t>
+      </w:r>
+    </w:p>
+    <w:p>
+      <w:r>
+        <w:t>接口边界：本次前端能力沿用现有 HTTP/WebSocket 协议和 draft、utterance、translation_update、summary_delta、postprocess_update 等事件，不新增会议数据结构或后端持久化格式。</w:t>
+      </w:r>
+    </w:p>
+    <w:p>
+      <w:pPr>
+        <w:pStyle w:val="1"/>
+      </w:pPr>
+      <w:r>
+        <w:rPr>
+          <w:rFonts w:ascii="Calibri" w:eastAsia="微软雅黑" w:hAnsi="Calibri" w:cs="微软雅黑"/>
+        </w:rPr>
+        <w:t xml:space="preserve">3. </w:t>
+      </w:r>
+      <w:r>
+        <w:rPr>
+          <w:rFonts w:ascii="Calibri" w:eastAsia="微软雅黑" w:hAnsi="Calibri" w:cs="微软雅黑"/>
+        </w:rPr>
+        <w:t>从一次会议到行动闭环</w:t>
+      </w:r>
+    </w:p>
+    <w:p>
+      <w:r>
+        <w:t>产品流程围绕“先保存、后完善、用户可控”设计：新建会议后可从参数模板开始，也可以在普通/高级设置中逐项微调；录音开始后会议级识别参数锁定，服务级模型、设备和积墨接口仍由部署侧管理。</w:t>
+      </w:r>
+    </w:p>
+    <w:p>
+      <w:pPr>
+        <w:pStyle w:val="a"/>
+      </w:pPr>
+      <w:r>
+        <w:t>会前预检与参数选择：确认 large-v3-turbo、large-v3、OPUS-MT、VAD 和 Resemblyzer 权重已准备；新建会议后可选择“均衡实时”“低延迟速记”或“高质量会议”模板，必要时手动微调为“自定义模板”；未就绪时阻止新建会议。</w:t>
+      </w:r>
+    </w:p>
+    <w:p>
+      <w:pPr>
+        <w:pStyle w:val="a"/>
+        <w:rPr>
+          <w:lang w:eastAsia="zh-CN"/>
+        </w:rPr>
+      </w:pPr>
+      <w:r>
+        <w:rPr>
+          <w:lang w:eastAsia="zh-CN"/>
+        </w:rPr>
+        <w:t>录音中：采集音频并按 30 分钟滚动切片保存；实时 ASR 以 draft 气泡持续更新逐句稿，最终 utterance 替换为正式原文消息，在线聚类提供匿名演讲人，英文和德文按批次异步补充中文翻译。</w:t>
       </w:r>
     </w:p>
     <w:p>
@@ -2179,38 +2027,7 @@
         <w:pStyle w:val="a"/>
       </w:pPr>
       <w:r>
-        <w:lastRenderedPageBreak/>
-        <w:t>后台后处理：</w:t>
-      </w:r>
-      <w:r>
-        <w:t xml:space="preserve">postprocess </w:t>
-      </w:r>
-      <w:r>
-        <w:t>自动执行精修</w:t>
-      </w:r>
-      <w:r>
-        <w:t xml:space="preserve"> ASR</w:t>
-      </w:r>
-      <w:r>
-        <w:t>、</w:t>
-      </w:r>
-      <w:r>
-        <w:t xml:space="preserve">Resemblyzer </w:t>
-      </w:r>
-      <w:r>
-        <w:t>说话人重排、对齐和最终翻译；全部完成后进入</w:t>
-      </w:r>
-      <w:r>
-        <w:t xml:space="preserve"> ready_for_summary</w:t>
-      </w:r>
-      <w:r>
-        <w:t>。用户点击按钮触发会议纪要，纪要成功后自动触发</w:t>
-      </w:r>
-      <w:r>
-        <w:t xml:space="preserve"> To-do-list</w:t>
-      </w:r>
-      <w:r>
-        <w:t>；每一阶段写入持久化检查点。</w:t>
+        <w:t>后台后处理：postprocess 自动执行精修 ASR、Resemblyzer 说话人重排、对齐和最终翻译；阶段条持续展示当前阶段和进度，全部完成后进入 ready_for_summary。用户点击按钮触发会议纪要，纪要成功后自动触发 To-do-list；每一阶段写入持久化检查点。</w:t>
       </w:r>
     </w:p>
     <w:p>
@@ -2218,19 +2035,7 @@
         <w:pStyle w:val="a"/>
       </w:pPr>
       <w:r>
-        <w:t>结果交付：前端接收</w:t>
-      </w:r>
-      <w:r>
-        <w:t xml:space="preserve"> postprocess_update </w:t>
-      </w:r>
-      <w:r>
-        <w:t>和单调递增的</w:t>
-      </w:r>
-      <w:r>
-        <w:t xml:space="preserve"> snapshot_revision</w:t>
-      </w:r>
-      <w:r>
-        <w:t>，原地更新原文、译文、说话人和下载文件；失败时展示具体阶段和重试入口。</w:t>
+        <w:t>结果交付：前端接收 postprocess_update 和单调递增的 snapshot_revision，原地更新原文、译文、说话人和下载文件；summary_delta 到达时持续追加会议纪要并显示生成中状态，完成或失败时保留结果并展示下载、重试入口。</w:t>
       </w:r>
     </w:p>
     <w:p>
@@ -2889,72 +2694,10 @@
       </w:r>
       <w:r>
         <w:rPr>
-          <w:b/>
-          <w:color w:val="9B1C1C"/>
-          <w:sz w:val="20"/>
-          <w:lang w:eastAsia="zh-CN"/>
-        </w:rPr>
-        <w:t xml:space="preserve">  </w:t>
-      </w:r>
-      <w:r>
-        <w:rPr>
           <w:sz w:val="21"/>
           <w:lang w:eastAsia="zh-CN"/>
         </w:rPr>
-        <w:t>正式支持三种语言，翻译方向固定为</w:t>
-      </w:r>
-      <w:r>
-        <w:rPr>
-          <w:sz w:val="21"/>
-          <w:lang w:eastAsia="zh-CN"/>
-        </w:rPr>
-        <w:t xml:space="preserve"> </w:t>
-      </w:r>
-      <w:proofErr w:type="spellStart"/>
-      <w:r>
-        <w:rPr>
-          <w:sz w:val="21"/>
-          <w:lang w:eastAsia="zh-CN"/>
-        </w:rPr>
-        <w:t>en→zh</w:t>
-      </w:r>
-      <w:proofErr w:type="spellEnd"/>
-      <w:r>
-        <w:rPr>
-          <w:sz w:val="21"/>
-          <w:lang w:eastAsia="zh-CN"/>
-        </w:rPr>
-        <w:t>、</w:t>
-      </w:r>
-      <w:proofErr w:type="spellStart"/>
-      <w:r>
-        <w:rPr>
-          <w:sz w:val="21"/>
-          <w:lang w:eastAsia="zh-CN"/>
-        </w:rPr>
-        <w:t>de→zh</w:t>
-      </w:r>
-      <w:proofErr w:type="spellEnd"/>
-      <w:r>
-        <w:rPr>
-          <w:sz w:val="21"/>
-          <w:lang w:eastAsia="zh-CN"/>
-        </w:rPr>
-        <w:t>；实时阶段的说话人是匿名编号而非实名身份；默认部署以单活跃会议、单</w:t>
-      </w:r>
-      <w:r>
-        <w:rPr>
-          <w:sz w:val="21"/>
-          <w:lang w:eastAsia="zh-CN"/>
-        </w:rPr>
-        <w:t xml:space="preserve"> GPU worker </w:t>
-      </w:r>
-      <w:r>
-        <w:rPr>
-          <w:sz w:val="21"/>
-          <w:lang w:eastAsia="zh-CN"/>
-        </w:rPr>
-        <w:t>为稳定基线。更大规模并发、多路音频输入、更多语言和实名声纹属于独立扩展能力。</w:t>
+        <w:t xml:space="preserve">  正式支持三种语言，翻译方向固定为 en→zh、de→zh；实时阶段的说话人是匿名编号而非实名身份；会议级设置仅在录音开始前可修改，服务级模型、计算设备、下载策略和积墨接口需要通过部署配置调整并重启服务。默认部署以单活跃会议、单 GPU worker 为稳定基线。更大规模并发、多路音频输入、更多语言和实名声纹属于独立扩展能力。</w:t>
       </w:r>
     </w:p>
     <w:p>
@@ -17892,47 +17635,10 @@
       </w:r>
       <w:r>
         <w:rPr>
-          <w:b/>
-          <w:color w:val="0F766E"/>
-          <w:sz w:val="20"/>
-          <w:lang w:eastAsia="zh-CN"/>
-        </w:rPr>
-        <w:t xml:space="preserve">  </w:t>
-      </w:r>
-      <w:r>
-        <w:rPr>
           <w:sz w:val="21"/>
           <w:lang w:eastAsia="zh-CN"/>
         </w:rPr>
-        <w:t>会记是一套本地优先的实时会议工作台，支持中文、英文和德文会议的实时转写与中译。它在录音期间用轻量实时模型帮助参会者跟上讨论，停录后自动用更高质量</w:t>
-      </w:r>
-      <w:r>
-        <w:rPr>
-          <w:sz w:val="21"/>
-          <w:lang w:eastAsia="zh-CN"/>
-        </w:rPr>
-        <w:t xml:space="preserve"> ASR </w:t>
-      </w:r>
-      <w:r>
-        <w:rPr>
-          <w:sz w:val="21"/>
-          <w:lang w:eastAsia="zh-CN"/>
-        </w:rPr>
-        <w:t>和说话人分离模型完成精修；精修、重排和翻译全部完成后，用户点击按钮生成会议纪要，随后系统自动生成</w:t>
-      </w:r>
-      <w:r>
-        <w:rPr>
-          <w:sz w:val="21"/>
-          <w:lang w:eastAsia="zh-CN"/>
-        </w:rPr>
-        <w:t xml:space="preserve"> To-do-list</w:t>
-      </w:r>
-      <w:r>
-        <w:rPr>
-          <w:sz w:val="21"/>
-          <w:lang w:eastAsia="zh-CN"/>
-        </w:rPr>
-        <w:t>。与单纯字幕或云端会议机器人不同，会记把录音保存、后台后处理和结果修订拆开，既保留本地数据边界，也让失败可见、任务可重试、结果可追溯。</w:t>
+        <w:t xml:space="preserve">  会记是一套本地优先的实时会议 AI 工作台，支持中文、英文和德文会议的实时转写与中译。左侧管理会议历史，中间通过流式逐句稿持续显示原文和中文翻译，右侧查看后台处理、会议纪要、To-do-list 和文件。用户可以在普通/高级设置中使用模板或滑块加数字输入微调会议参数；录音期间用轻量实时模型帮助参会者跟上讨论，停录后自动用更高质量 ASR 和说话人重排完成精修，会议纪要支持流式生成并自动生成 To-do-list。与单纯字幕或云端会议机器人不同，会记把录音保存、后台后处理和结果修订拆开，既保留本地数据边界，也让失败可见、任务可重试、结果可追溯。</w:t>
       </w:r>
     </w:p>
     <w:p>
@@ -17956,55 +17662,7 @@
     </w:p>
     <w:p>
       <w:r>
-        <w:t>产品与技术参数依据本仓库的</w:t>
-      </w:r>
-      <w:r>
-        <w:t xml:space="preserve"> README.md</w:t>
-      </w:r>
-      <w:r>
-        <w:t>、</w:t>
-      </w:r>
-      <w:r>
-        <w:t>DEPLOYMENT.md</w:t>
-      </w:r>
-      <w:r>
-        <w:t>、</w:t>
-      </w:r>
-      <w:r>
-        <w:t>pyproject.toml</w:t>
-      </w:r>
-      <w:r>
-        <w:t>、</w:t>
-      </w:r>
-      <w:r>
-        <w:t>realtime_meeting/config.py</w:t>
-      </w:r>
-      <w:r>
-        <w:t>、</w:t>
-      </w:r>
-      <w:r>
-        <w:t>runtime.py</w:t>
-      </w:r>
-      <w:r>
-        <w:t>、</w:t>
-      </w:r>
-      <w:r>
-        <w:t>session.py</w:t>
-      </w:r>
-      <w:r>
-        <w:t>、</w:t>
-      </w:r>
-      <w:r>
-        <w:t xml:space="preserve">storage.py </w:t>
-      </w:r>
-      <w:r>
-        <w:t>和已实现的产品能力整理；竞品与模型资料为公开官方页面，访问日期：</w:t>
-      </w:r>
-      <w:r>
-        <w:t>2026-08-13</w:t>
-      </w:r>
-      <w:r>
-        <w:t>。公开产品能力可能随版本、地区和套餐变化。</w:t>
+        <w:t>产品与技术参数依据本仓库的 README.md、DEPLOYMENT.md、pyproject.toml、realtime_meeting/config.py、runtime.py、session.py、storage.py、realtime_meeting/web/index.html、app.js、styles.css 和已实现的产品能力整理；前端模板、流式逐句稿和设置交互以 2026-08-13 版本为准。竞品与模型资料为公开官方页面，访问日期：2026-08-13。公开产品能力可能随版本、地区和套餐变化。</w:t>
       </w:r>
     </w:p>
     <w:p>

</xml_diff>

<commit_message>
fix: harden meeting pipeline and update product docs
</commit_message>
<xml_diff>
--- a/会记_产品介绍.docx
+++ b/会记_产品介绍.docx
@@ -1259,7 +1259,7 @@
         <w:rPr>
           <w:lang w:eastAsia="zh-CN"/>
         </w:rPr>
-        <w:t>实时链路统一使用 large-v3-turbo，默认 beam_size=5、best_of=5；实时短片段会复用上一句语言先验和最近最多 3 句上下文（最多 500 字符），遇到低质量结果时清除这些先验并自动重试，降低模型切换和隐式回退带来的不确定性。浏览器通过 AudioWorklet 采集 16 kHz、单声道 PCM16 音频，FastAPI WebSocket 接收并将 draft、partial/final 结果推送到前端。draft 采用服务端实际返回的完整快照持续替换识别中气泡，不模拟逐字打字；最终 utterance 生成后清理对应草稿。中文原文直接显示，英文和德文进入本地 OPUS-MT 翻译队列后在对应消息下方补充简体中文翻译。</w:t>
+        <w:t>实时链路统一使用 large-v3-turbo，默认 beam_size=5、best_of=5；录音中可在中文、英文、德文之间设置语言锁定：单选强制 ASR 语言，多选限制语言检测范围；锁定状态会持久化，并应用于停止后的 ASR 精修。实时短片段会复用上一句语言先验和最近最多 3 句上下文（最多 500 字符），遇到低质量结果时清除这些先验并自动重试，降低模型切换和隐式回退带来的不确定性。浏览器通过 AudioWorklet 采集 16 kHz、单声道 PCM16 音频，FastAPI WebSocket 接收并将 draft、partial/final 结果推送到前端。draft 采用服务端实际返回的完整快照持续替换识别中气泡，不模拟逐字打字；最终 utterance 生成后清理对应草稿。中文原文直接显示，英文和德文进入本地 OPUS-MT 翻译队列后在对应消息下方补充简体中文翻译。</w:t>
       </w:r>
     </w:p>
     <w:p>
@@ -1891,7 +1891,7 @@
         <w:pStyle w:val="a"/>
       </w:pPr>
       <w:r>
-        <w:t>实时逐句稿：服务端 draft 增量直接更新底部“正在识别”气泡；收到 utterance 后清理对应草稿并插入正式消息。每条消息保留说话人、时间和语言元信息，原文与中文翻译上下叠放；中文原文不重复显示翻译，英文和德文在 translation_update 到达后只更新对应翻译气泡。</w:t>
+        <w:t>实时逐句稿：服务端 draft 增量直接更新底部“正在识别”气泡；收到 utterance 后清理对应草稿并插入正式消息。每条消息保留说话人、时间和语言元信息，原文与中文翻译上下叠放；中文原文不重复显示翻译，英文和德文在 translation_update 到达后只更新对应翻译气泡。语言锁定通过 language_lock / language_lock_ack 同步到前后端：单选强制 ASR 语言，多选限制检测候选范围。</w:t>
       </w:r>
     </w:p>
     <w:p>
@@ -1920,7 +1920,7 @@
     </w:p>
     <w:p>
       <w:r>
-        <w:t>接口边界：本次前端能力沿用现有 HTTP/WebSocket 协议和 draft、utterance、translation_update、summary_delta、postprocess_update 等事件，不新增会议数据结构或后端持久化格式。</w:t>
+        <w:t>接口边界：本次前端能力沿用现有 HTTP/WebSocket 协议和 language_lock、language_lock_ack、draft、utterance、translation_update、summary_delta、postprocess_update 等事件，不新增会议数据结构或后端持久化格式。</w:t>
       </w:r>
     </w:p>
     <w:p>
@@ -1942,7 +1942,7 @@
     </w:p>
     <w:p>
       <w:r>
-        <w:t>产品流程围绕“先保存、后完善、用户可控”设计：新建会议后可从参数模板开始，也可以在普通/高级设置中逐项微调；录音开始后会议级识别参数锁定，服务级模型、设备和积墨接口仍由部署侧管理。</w:t>
+        <w:t>产品流程围绕“先保存、后完善、用户可控”设计：新建会议后可从参数模板开始，也可以在普通/高级设置中逐项微调；录音开始后会议级识别参数默认锁定；语言锁定可在录音中调整，并同步影响后续实时识别和停止后的 ASR 精修，服务级模型、设备和积墨接口仍由部署侧管理。</w:t>
       </w:r>
     </w:p>
     <w:p>
@@ -2697,7 +2697,7 @@
           <w:sz w:val="21"/>
           <w:lang w:eastAsia="zh-CN"/>
         </w:rPr>
-        <w:t xml:space="preserve">  正式支持三种语言，翻译方向固定为 en→zh、de→zh；实时阶段的说话人是匿名编号而非实名身份；会议级设置仅在录音开始前可修改，服务级模型、计算设备、下载策略和积墨接口需要通过部署配置调整并重启服务。默认部署以单活跃会议、单 GPU worker 为稳定基线。更大规模并发、多路音频输入、更多语言和实名声纹属于独立扩展能力。</w:t>
+        <w:t xml:space="preserve">  正式支持三种语言，翻译方向固定为 en→zh、de→zh；语言锁定支持 zh/en/de，单选强制识别语言，多选限定检测范围；实时阶段的说话人是匿名编号而非实名身份；会议级识别参数默认仅在录音开始前可修改，语言锁定是可在录音中调整的例外；服务级模型、计算设备、下载策略和积墨接口需要通过部署配置调整并重启服务。默认部署以单活跃会议、单 GPU worker 为稳定基线。更大规模并发、多路音频输入、更多语言和实名声纹属于独立扩展能力。</w:t>
       </w:r>
     </w:p>
     <w:p>
@@ -11057,7 +11057,7 @@
         <w:rPr>
           <w:lang w:eastAsia="zh-CN"/>
         </w:rPr>
-        <w:t xml:space="preserve"> 2026-08-13 </w:t>
+        <w:t xml:space="preserve"> 2026-08-14 </w:t>
       </w:r>
       <w:r>
         <w:rPr>
@@ -12187,7 +12187,7 @@
               <w:rPr>
                 <w:sz w:val="16"/>
               </w:rPr>
-              <w:t xml:space="preserve"> Lingua；低质量结果自动清除先验重试</w:t>
+              <w:t xml:space="preserve"> Lingua；低质量结果自动清除先验重试；语言锁定支持单选强制、多选限制</w:t>
             </w:r>
             <w:r>
               <w:rPr>
@@ -17638,7 +17638,7 @@
           <w:sz w:val="21"/>
           <w:lang w:eastAsia="zh-CN"/>
         </w:rPr>
-        <w:t xml:space="preserve">  会记是一套本地优先的实时会议 AI 工作台，支持中文、英文和德文会议的实时转写与中译。左侧管理会议历史，中间通过流式逐句稿持续显示原文和中文翻译，右侧查看后台处理、会议纪要、To-do-list 和文件。用户可以在普通/高级设置中使用模板或滑块加数字输入微调会议参数；录音期间用轻量实时模型帮助参会者跟上讨论，停录后自动用更高质量 ASR 和说话人重排完成精修，会议纪要支持流式生成并自动生成 To-do-list。与单纯字幕或云端会议机器人不同，会记把录音保存、后台后处理和结果修订拆开，既保留本地数据边界，也让失败可见、任务可重试、结果可追溯。</w:t>
+        <w:t xml:space="preserve">  会记是一套本地优先的实时会议 AI 工作台，支持中文、英文和德文会议的实时转写与中译。左侧管理会议历史，中间通过流式逐句稿持续显示原文和中文翻译，右侧查看后台处理、会议纪要、To-do-list 和文件。用户可以在普通/高级设置中使用模板或滑块加数字输入微调会议参数；录音中还可按中文、英文或德文锁定识别范围；录音期间用轻量实时模型帮助参会者跟上讨论，停录后自动用更高质量 ASR 和说话人重排完成精修，会议纪要支持流式生成并自动生成 To-do-list。与单纯字幕或云端会议机器人不同，会记把录音保存、后台后处理和结果修订拆开，既保留本地数据边界，也让失败可见、任务可重试、结果可追溯。</w:t>
       </w:r>
     </w:p>
     <w:p>
@@ -17662,7 +17662,7 @@
     </w:p>
     <w:p>
       <w:r>
-        <w:t>产品与技术参数依据本仓库的 README.md、DEPLOYMENT.md、pyproject.toml、realtime_meeting/config.py、runtime.py、session.py、storage.py、realtime_meeting/web/index.html、app.js、styles.css 和已实现的产品能力整理；前端模板、流式逐句稿和设置交互以 2026-08-13 版本为准。竞品与模型资料为公开官方页面，访问日期：2026-08-13。公开产品能力可能随版本、地区和套餐变化。</w:t>
+        <w:t>产品与技术参数依据本仓库的 README.md、DEPLOYMENT.md、pyproject.toml、realtime_meeting/config.py、runtime.py、session.py、storage.py、realtime_meeting/web/index.html、app.js、styles.css 和已实现的产品能力整理；前端模板、流式逐句稿和设置交互以 2026-08-14 版本为准。竞品与模型资料为公开官方页面，访问日期：2026-08-13。公开产品能力可能随版本、地区和套餐变化。</w:t>
       </w:r>
     </w:p>
     <w:p>

</xml_diff>

<commit_message>
Improve ASR retries and Sichuan evaluation docs
</commit_message>
<xml_diff>
--- a/会记_产品介绍.docx
+++ b/会记_产品介绍.docx
@@ -287,7 +287,7 @@
                 <w:color w:val="172233"/>
                 <w:sz w:val="19"/>
               </w:rPr>
-              <w:t>Qwen3-ASR 双模型 + 连续语音段落输出，两套实时识别架构可选</w:t>
+              <w:t>Qwen3-ASR-1.7B 单模型 + 同模语言确认 + 连续语音段落输出</w:t>
             </w:r>
           </w:p>
         </w:tc>
@@ -362,7 +362,7 @@
                 <w:color w:val="172233"/>
                 <w:sz w:val="19"/>
               </w:rPr>
-              <w:t>中文、英文、德文；中文方言由小千问判断并按官方类别归一化记录</w:t>
+              <w:t>普通话、中文方言、英文、德文；中文方言由同一 Qwen 1.7B 判断并按官方类别记录</w:t>
             </w:r>
           </w:p>
         </w:tc>
@@ -1218,7 +1218,7 @@
                 <w:color w:val="172233"/>
                 <w:sz w:val="19"/>
               </w:rPr>
-              <w:t>界面选择的是两套实时识别架构，清楚说明主模型、语言/方言判断模型和回退关系。</w:t>
+              <w:t>生产链路固定使用 Qwen3-ASR-1.7B；同一模型负责识别、语言确认和冲突重识别，旧 fallback/LID 字段仅作兼容别名。</w:t>
             </w:r>
           </w:p>
         </w:tc>
@@ -1530,7 +1530,7 @@
           <w:color w:val="0B4F8A"/>
           <w:sz w:val="28"/>
         </w:rPr>
-        <w:t>2.1 两套实时识别架构</w:t>
+        <w:t>2.1 单一 Qwen 实时识别架构</w:t>
       </w:r>
     </w:p>
     <w:p>
@@ -1539,7 +1539,7 @@
         <w:rPr>
           <w:rFonts w:ascii="Microsoft YaHei" w:hAnsi="Microsoft YaHei" w:eastAsia="Microsoft YaHei"/>
         </w:rPr>
-        <w:t>当前界面的“实时识别架构”选择的是实时 ASR 的主模型和回退关系，不是“全程只使用一种模型”。两套架构都会使用 Qwen3-ASR-0.6B 做语言/方言判断；录音开始后，本次会议的架构会锁定。</w:t>
+        <w:t>当前生产链路固定使用一个 Qwen3-ASR-1.7B：最终 ASR、分段级语言确认和语言冲突重识别共用同一模型。对空结果、短片段或质量信号较弱的最终段，系统会清空上一段上下文，用同一个 1.7B 再识别一次；这不是第二模型或会后隐藏流程。旧的 fallback 与 language ID 字段仍保留用于兼容，但在单模型模式下不会加载 0.6B，也不再提供两套实时识别架构选择。</w:t>
       </w:r>
     </w:p>
     <w:tbl>
@@ -1562,7 +1562,7 @@
         </w:trPr>
         <w:tc>
           <w:tcPr>
-            <w:tcW w:type="dxa" w:w="2232"/>
+            <w:tcW w:type="dxa" w:w="1944"/>
             <w:shd w:fill="E7EEF6"/>
             <w:tcBorders>
               <w:top w:val="single" w:sz="8" w:space="0" w:color="D4DEE9"/>
@@ -1591,13 +1591,13 @@
                 <w:color w:val="0B4F8A"/>
                 <w:sz w:val="17"/>
               </w:rPr>
-              <w:t>界面选项</w:t>
+              <w:t>链路</w:t>
             </w:r>
           </w:p>
         </w:tc>
         <w:tc>
           <w:tcPr>
-            <w:tcW w:type="dxa" w:w="3672"/>
+            <w:tcW w:type="dxa" w:w="4032"/>
             <w:shd w:fill="E7EEF6"/>
             <w:tcBorders>
               <w:top w:val="single" w:sz="8" w:space="0" w:color="D4DEE9"/>
@@ -1626,13 +1626,13 @@
                 <w:color w:val="0B4F8A"/>
                 <w:sz w:val="17"/>
               </w:rPr>
-              <w:t>实际链路</w:t>
+              <w:t>实际行为</w:t>
             </w:r>
           </w:p>
         </w:tc>
         <w:tc>
           <w:tcPr>
-            <w:tcW w:type="dxa" w:w="2448"/>
+            <w:tcW w:type="dxa" w:w="2520"/>
             <w:shd w:fill="E7EEF6"/>
             <w:tcBorders>
               <w:top w:val="single" w:sz="8" w:space="0" w:color="D4DEE9"/>
@@ -1661,13 +1661,13 @@
                 <w:color w:val="0B4F8A"/>
                 <w:sz w:val="17"/>
               </w:rPr>
-              <w:t>适合场景</w:t>
+              <w:t>产品取舍</w:t>
             </w:r>
           </w:p>
         </w:tc>
         <w:tc>
           <w:tcPr>
-            <w:tcW w:type="dxa" w:w="2016"/>
+            <w:tcW w:type="dxa" w:w="1944"/>
             <w:shd w:fill="E7EEF6"/>
             <w:tcBorders>
               <w:top w:val="single" w:sz="8" w:space="0" w:color="D4DEE9"/>
@@ -1696,7 +1696,7 @@
                 <w:color w:val="0B4F8A"/>
                 <w:sz w:val="17"/>
               </w:rPr>
-              <w:t>录音开始后</w:t>
+              <w:t>录音期间</w:t>
             </w:r>
           </w:p>
         </w:tc>
@@ -1707,7 +1707,7 @@
         </w:trPr>
         <w:tc>
           <w:tcPr>
-            <w:tcW w:type="dxa" w:w="2232"/>
+            <w:tcW w:type="dxa" w:w="1944"/>
             <w:tcBorders>
               <w:top w:val="single" w:sz="8" w:space="0" w:color="D4DEE9"/>
               <w:left w:val="single" w:sz="8" w:space="0" w:color="D4DEE9"/>
@@ -1736,13 +1736,13 @@
                 <w:color w:val="172233"/>
                 <w:sz w:val="17"/>
               </w:rPr>
-              <w:t>大+小千问 · 质量优先</w:t>
+              <w:t>生产默认链路</w:t>
             </w:r>
           </w:p>
         </w:tc>
         <w:tc>
           <w:tcPr>
-            <w:tcW w:type="dxa" w:w="3672"/>
+            <w:tcW w:type="dxa" w:w="4032"/>
             <w:tcBorders>
               <w:top w:val="single" w:sz="8" w:space="0" w:color="D4DEE9"/>
               <w:left w:val="single" w:sz="8" w:space="0" w:color="D4DEE9"/>
@@ -1771,13 +1771,13 @@
                 <w:color w:val="172233"/>
                 <w:sz w:val="17"/>
               </w:rPr>
-              <w:t>1.7B 主识别；0.6B 负责语言/方言判断并作为实时回退</w:t>
+              <w:t>Qwen3-ASR-1.7B 同时承担最终 ASR、分段级语言确认和冲突重识别</w:t>
             </w:r>
           </w:p>
         </w:tc>
         <w:tc>
           <w:tcPr>
-            <w:tcW w:type="dxa" w:w="2448"/>
+            <w:tcW w:type="dxa" w:w="2520"/>
             <w:tcBorders>
               <w:top w:val="single" w:sz="8" w:space="0" w:color="D4DEE9"/>
               <w:left w:val="single" w:sz="8" w:space="0" w:color="D4DEE9"/>
@@ -1806,13 +1806,13 @@
                 <w:color w:val="172233"/>
                 <w:sz w:val="17"/>
               </w:rPr>
-              <w:t>更看重实时识别质量和稳定性</w:t>
+              <w:t>优先保证中英德及中文方言识别准确率</w:t>
             </w:r>
           </w:p>
         </w:tc>
         <w:tc>
           <w:tcPr>
-            <w:tcW w:type="dxa" w:w="2016"/>
+            <w:tcW w:type="dxa" w:w="1944"/>
             <w:tcBorders>
               <w:top w:val="single" w:sz="8" w:space="0" w:color="D4DEE9"/>
               <w:left w:val="single" w:sz="8" w:space="0" w:color="D4DEE9"/>
@@ -1841,7 +1841,7 @@
                 <w:color w:val="172233"/>
                 <w:sz w:val="17"/>
               </w:rPr>
-              <w:t>架构锁定，异常时切换到 0.6B</w:t>
+              <w:t>同一 checkpoint 常驻；冲突时重识别对应时间窗</w:t>
             </w:r>
           </w:p>
         </w:tc>
@@ -1852,7 +1852,7 @@
         </w:trPr>
         <w:tc>
           <w:tcPr>
-            <w:tcW w:type="dxa" w:w="2232"/>
+            <w:tcW w:type="dxa" w:w="1944"/>
             <w:tcBorders>
               <w:top w:val="single" w:sz="8" w:space="0" w:color="D4DEE9"/>
               <w:left w:val="single" w:sz="8" w:space="0" w:color="D4DEE9"/>
@@ -1880,13 +1880,13 @@
                 <w:color w:val="172233"/>
                 <w:sz w:val="17"/>
               </w:rPr>
-              <w:t>小千问主识别 · 低延迟</w:t>
+              <w:t>兼容配置</w:t>
             </w:r>
           </w:p>
         </w:tc>
         <w:tc>
           <w:tcPr>
-            <w:tcW w:type="dxa" w:w="3672"/>
+            <w:tcW w:type="dxa" w:w="4032"/>
             <w:tcBorders>
               <w:top w:val="single" w:sz="8" w:space="0" w:color="D4DEE9"/>
               <w:left w:val="single" w:sz="8" w:space="0" w:color="D4DEE9"/>
@@ -1914,13 +1914,13 @@
                 <w:color w:val="172233"/>
                 <w:sz w:val="17"/>
               </w:rPr>
-              <w:t>0.6B 主识别；0.6B 仍负责语言/方言判断，1.7B 作为异常回退</w:t>
+              <w:t>旧 realtime_asr_model、fallback、language ID 字段统一归一到 primary</w:t>
             </w:r>
           </w:p>
         </w:tc>
         <w:tc>
           <w:tcPr>
-            <w:tcW w:type="dxa" w:w="2448"/>
+            <w:tcW w:type="dxa" w:w="2520"/>
             <w:tcBorders>
               <w:top w:val="single" w:sz="8" w:space="0" w:color="D4DEE9"/>
               <w:left w:val="single" w:sz="8" w:space="0" w:color="D4DEE9"/>
@@ -1948,13 +1948,13 @@
                 <w:color w:val="172233"/>
                 <w:sz w:val="17"/>
               </w:rPr>
-              <w:t>更看重响应速度和较低资源占用</w:t>
+              <w:t>保持旧 WebSocket、会议设置和存储协议兼容</w:t>
             </w:r>
           </w:p>
         </w:tc>
         <w:tc>
           <w:tcPr>
-            <w:tcW w:type="dxa" w:w="2016"/>
+            <w:tcW w:type="dxa" w:w="1944"/>
             <w:tcBorders>
               <w:top w:val="single" w:sz="8" w:space="0" w:color="D4DEE9"/>
               <w:left w:val="single" w:sz="8" w:space="0" w:color="D4DEE9"/>
@@ -1982,7 +1982,152 @@
                 <w:color w:val="172233"/>
                 <w:sz w:val="17"/>
               </w:rPr>
-              <w:t>架构锁定，异常时切换到 1.7B</w:t>
+              <w:t>不会触发 0.6B 加载或第二条 ASR 链路</w:t>
+            </w:r>
+          </w:p>
+        </w:tc>
+      </w:tr>
+      <w:tr>
+        <w:trPr>
+          <w:cantSplit/>
+        </w:trPr>
+        <w:tc>
+          <w:tcPr>
+            <w:tcW w:type="dxa" w:w="1944"/>
+            <w:tcBorders>
+              <w:top w:val="single" w:sz="8" w:space="0" w:color="D4DEE9"/>
+              <w:left w:val="single" w:sz="8" w:space="0" w:color="D4DEE9"/>
+              <w:bottom w:val="single" w:sz="8" w:space="0" w:color="D4DEE9"/>
+              <w:right w:val="single" w:sz="8" w:space="0" w:color="D4DEE9"/>
+              <w:insideH w:val="single" w:sz="8" w:space="0" w:color="D4DEE9"/>
+              <w:insideV w:val="single" w:sz="8" w:space="0" w:color="D4DEE9"/>
+            </w:tcBorders>
+            <w:tcMar>
+              <w:top w:w="100" w:type="dxa"/>
+              <w:start w:w="140" w:type="dxa"/>
+              <w:bottom w:w="100" w:type="dxa"/>
+              <w:end w:w="140" w:type="dxa"/>
+            </w:tcMar>
+            <w:shd w:fill="F7FAFC"/>
+            <w:vAlign w:val="center"/>
+          </w:tcPr>
+          <w:p>
+            <w:pPr>
+              <w:spacing w:after="0" w:line="264" w:lineRule="auto"/>
+            </w:pPr>
+            <w:r>
+              <w:rPr>
+                <w:rFonts w:ascii="Microsoft YaHei" w:hAnsi="Microsoft YaHei" w:eastAsia="Microsoft YaHei"/>
+                <w:b/>
+                <w:color w:val="172233"/>
+                <w:sz w:val="17"/>
+              </w:rPr>
+              <w:t>低质量段二次识别</w:t>
+            </w:r>
+          </w:p>
+        </w:tc>
+        <w:tc>
+          <w:tcPr>
+            <w:tcW w:type="dxa" w:w="4032"/>
+            <w:tcBorders>
+              <w:top w:val="single" w:sz="8" w:space="0" w:color="D4DEE9"/>
+              <w:left w:val="single" w:sz="8" w:space="0" w:color="D4DEE9"/>
+              <w:bottom w:val="single" w:sz="8" w:space="0" w:color="D4DEE9"/>
+              <w:right w:val="single" w:sz="8" w:space="0" w:color="D4DEE9"/>
+              <w:insideH w:val="single" w:sz="8" w:space="0" w:color="D4DEE9"/>
+              <w:insideV w:val="single" w:sz="8" w:space="0" w:color="D4DEE9"/>
+            </w:tcBorders>
+            <w:tcMar>
+              <w:top w:w="100" w:type="dxa"/>
+              <w:start w:w="140" w:type="dxa"/>
+              <w:bottom w:w="100" w:type="dxa"/>
+              <w:end w:w="140" w:type="dxa"/>
+            </w:tcMar>
+            <w:shd w:fill="F7FAFC"/>
+            <w:vAlign w:val="center"/>
+          </w:tcPr>
+          <w:p>
+            <w:pPr>
+              <w:spacing w:after="0" w:line="264" w:lineRule="auto"/>
+            </w:pPr>
+            <w:r>
+              <w:rPr>
+                <w:rFonts w:ascii="Microsoft YaHei" w:hAnsi="Microsoft YaHei" w:eastAsia="Microsoft YaHei"/>
+                <w:b w:val="0"/>
+                <w:color w:val="172233"/>
+                <w:sz w:val="17"/>
+              </w:rPr>
+              <w:t>空结果、短于 1.8 秒或质量信号较弱时，清空上文并再次调用同一个 1.7B</w:t>
+            </w:r>
+          </w:p>
+        </w:tc>
+        <w:tc>
+          <w:tcPr>
+            <w:tcW w:type="dxa" w:w="2520"/>
+            <w:tcBorders>
+              <w:top w:val="single" w:sz="8" w:space="0" w:color="D4DEE9"/>
+              <w:left w:val="single" w:sz="8" w:space="0" w:color="D4DEE9"/>
+              <w:bottom w:val="single" w:sz="8" w:space="0" w:color="D4DEE9"/>
+              <w:right w:val="single" w:sz="8" w:space="0" w:color="D4DEE9"/>
+              <w:insideH w:val="single" w:sz="8" w:space="0" w:color="D4DEE9"/>
+              <w:insideV w:val="single" w:sz="8" w:space="0" w:color="D4DEE9"/>
+            </w:tcBorders>
+            <w:tcMar>
+              <w:top w:w="100" w:type="dxa"/>
+              <w:start w:w="140" w:type="dxa"/>
+              <w:bottom w:w="100" w:type="dxa"/>
+              <w:end w:w="140" w:type="dxa"/>
+            </w:tcMar>
+            <w:shd w:fill="F7FAFC"/>
+            <w:vAlign w:val="center"/>
+          </w:tcPr>
+          <w:p>
+            <w:pPr>
+              <w:spacing w:after="0" w:line="264" w:lineRule="auto"/>
+            </w:pPr>
+            <w:r>
+              <w:rPr>
+                <w:rFonts w:ascii="Microsoft YaHei" w:hAnsi="Microsoft YaHei" w:eastAsia="Microsoft YaHei"/>
+                <w:b w:val="0"/>
+                <w:color w:val="172233"/>
+                <w:sz w:val="17"/>
+              </w:rPr>
+              <w:t>用局部额外耗时换取短片段覆盖率，不改变模型架构</w:t>
+            </w:r>
+          </w:p>
+        </w:tc>
+        <w:tc>
+          <w:tcPr>
+            <w:tcW w:type="dxa" w:w="1944"/>
+            <w:tcBorders>
+              <w:top w:val="single" w:sz="8" w:space="0" w:color="D4DEE9"/>
+              <w:left w:val="single" w:sz="8" w:space="0" w:color="D4DEE9"/>
+              <w:bottom w:val="single" w:sz="8" w:space="0" w:color="D4DEE9"/>
+              <w:right w:val="single" w:sz="8" w:space="0" w:color="D4DEE9"/>
+              <w:insideH w:val="single" w:sz="8" w:space="0" w:color="D4DEE9"/>
+              <w:insideV w:val="single" w:sz="8" w:space="0" w:color="D4DEE9"/>
+            </w:tcBorders>
+            <w:tcMar>
+              <w:top w:w="100" w:type="dxa"/>
+              <w:start w:w="140" w:type="dxa"/>
+              <w:bottom w:w="100" w:type="dxa"/>
+              <w:end w:w="140" w:type="dxa"/>
+            </w:tcMar>
+            <w:shd w:fill="F7FAFC"/>
+            <w:vAlign w:val="center"/>
+          </w:tcPr>
+          <w:p>
+            <w:pPr>
+              <w:spacing w:after="0" w:line="264" w:lineRule="auto"/>
+            </w:pPr>
+            <w:r>
+              <w:rPr>
+                <w:rFonts w:ascii="Microsoft YaHei" w:hAnsi="Microsoft YaHei" w:eastAsia="Microsoft YaHei"/>
+                <w:b w:val="0"/>
+                <w:color w:val="172233"/>
+                <w:sz w:val="17"/>
+              </w:rPr>
+              <w:t>仅在触发条件满足时执行；结果不改善则保留首轮结果</w:t>
             </w:r>
           </w:p>
         </w:tc>
@@ -2039,7 +2184,7 @@
                 <w:color w:val="172233"/>
                 <w:sz w:val="20"/>
               </w:rPr>
-              <w:t>“大+小千问”表示 1.7B 主识别 + 0.6B 判断/兜底；“小千问主识别”表示 0.6B 主识别 + 1.7B 兜底，并不代表全程只使用大千问或小千问。</w:t>
+              <w:t>当前版本不再在界面提供两套实时识别架构选择；全流程只加载 Qwen3-ASR-1.7B。这样牺牲少量即时响应换取更稳定的中英德语言判断、方言识别和冲突重识别质量。</w:t>
             </w:r>
           </w:p>
         </w:tc>
@@ -2067,7 +2212,7 @@
         <w:rPr>
           <w:rFonts w:ascii="Microsoft YaHei" w:hAnsi="Microsoft YaHei" w:eastAsia="Microsoft YaHei"/>
         </w:rPr>
-        <w:t>当前结果保留 zh / en / de / unknown；中文方言由 0.6B 判断，并按 Qwen 官方 22 类归一化记录，包含浙江、粤语香港/广东口音、吴语和闽南语等代表类别。</w:t>
+        <w:t>当前结果保留 zh / en / de / unknown；中文方言由同一 Qwen3-ASR-1.7B 判断，并按 Qwen 官方 22 类归一化记录，包含四川、浙江、粤语香港/广东口音、吴语和闽南语等代表类别。</w:t>
       </w:r>
     </w:p>
     <w:p>
@@ -2078,7 +2223,7 @@
         <w:rPr>
           <w:rFonts w:ascii="Microsoft YaHei" w:hAnsi="Microsoft YaHei" w:eastAsia="Microsoft YaHei"/>
         </w:rPr>
-        <w:t>普通话和中文方言直接规范为简体中文；英文、德文以及中英混合段落按稳定原文前缀排队翻译为简体中文。</w:t>
+        <w:t>普通话和中文方言不经过单独的方言翻译，直接输出识别得到的中文文本（通常为简体字）；当前不会把四川话等方言自动改写成普通话语义。英文、德文以及中英混合段落按稳定原文前缀排队翻译为简体中文。</w:t>
       </w:r>
     </w:p>
     <w:p>
@@ -2089,7 +2234,7 @@
         <w:rPr>
           <w:rFonts w:ascii="Microsoft YaHei" w:hAnsi="Microsoft YaHei" w:eastAsia="Microsoft YaHei"/>
         </w:rPr>
-        <w:t>语言首次出现先作为候选，连续确认后才触发段落边界；短暂 unknown 不会制造额外段落。</w:t>
+        <w:t>约 1 秒后开始语言探测，新语言连续 3 次一致才触发段落边界；短暂 unknown 不改变当前语言，中文方言变化只更新 speech_variant。</w:t>
       </w:r>
     </w:p>
     <w:p>
@@ -2336,7 +2481,7 @@
                 <w:color w:val="172233"/>
                 <w:sz w:val="18"/>
               </w:rPr>
-              <w:t>VAD 和静音阈值决定连续语音段；0.6B 判断语言/方言，主 ASR 按已选架构输出 partial。</w:t>
+              <w:t>VAD 保留带时间戳的音频帧；同一 Qwen3-ASR-1.7B 输出 partial/final，并按约 1 秒刷新，优先质量而非最短响应。</w:t>
             </w:r>
           </w:p>
         </w:tc>
@@ -2376,7 +2521,7 @@
                 <w:color w:val="172233"/>
                 <w:sz w:val="18"/>
               </w:rPr>
-              <w:t>段落聚合</w:t>
+              <w:t>语言切换</w:t>
             </w:r>
           </w:p>
         </w:tc>
@@ -2411,7 +2556,155 @@
                 <w:color w:val="172233"/>
                 <w:sz w:val="18"/>
               </w:rPr>
-              <w:t>同一连续语音段使用同一个 segment_id；partial 持续修订，段落关闭后形成稳定原文。</w:t>
+              <w:t>同模语言证据聚合器连续确认切换时间，再按时间切开旧/新窗口重整理 ASR，避免漏字、重复和错序。</w:t>
+            </w:r>
+          </w:p>
+        </w:tc>
+      </w:tr>
+      <w:tr>
+        <w:trPr>
+          <w:cantSplit/>
+        </w:trPr>
+        <w:tc>
+          <w:tcPr>
+            <w:tcW w:type="dxa" w:w="1800"/>
+            <w:tcBorders>
+              <w:top w:val="single" w:sz="8" w:space="0" w:color="D4DEE9"/>
+              <w:left w:val="single" w:sz="8" w:space="0" w:color="D4DEE9"/>
+              <w:bottom w:val="single" w:sz="8" w:space="0" w:color="D4DEE9"/>
+              <w:right w:val="single" w:sz="8" w:space="0" w:color="D4DEE9"/>
+              <w:insideH w:val="single" w:sz="8" w:space="0" w:color="D4DEE9"/>
+              <w:insideV w:val="single" w:sz="8" w:space="0" w:color="D4DEE9"/>
+            </w:tcBorders>
+            <w:tcMar>
+              <w:top w:w="100" w:type="dxa"/>
+              <w:start w:w="140" w:type="dxa"/>
+              <w:bottom w:w="100" w:type="dxa"/>
+              <w:end w:w="140" w:type="dxa"/>
+            </w:tcMar>
+            <w:vAlign w:val="center"/>
+          </w:tcPr>
+          <w:p>
+            <w:pPr>
+              <w:spacing w:after="0" w:line="264" w:lineRule="auto"/>
+            </w:pPr>
+            <w:r>
+              <w:rPr>
+                <w:rFonts w:ascii="Microsoft YaHei" w:hAnsi="Microsoft YaHei" w:eastAsia="Microsoft YaHei"/>
+                <w:b/>
+                <w:color w:val="172233"/>
+                <w:sz w:val="18"/>
+              </w:rPr>
+              <w:t>段落聚合</w:t>
+            </w:r>
+          </w:p>
+        </w:tc>
+        <w:tc>
+          <w:tcPr>
+            <w:tcW w:type="dxa" w:w="8640"/>
+            <w:tcBorders>
+              <w:top w:val="single" w:sz="8" w:space="0" w:color="D4DEE9"/>
+              <w:left w:val="single" w:sz="8" w:space="0" w:color="D4DEE9"/>
+              <w:bottom w:val="single" w:sz="8" w:space="0" w:color="D4DEE9"/>
+              <w:right w:val="single" w:sz="8" w:space="0" w:color="D4DEE9"/>
+              <w:insideH w:val="single" w:sz="8" w:space="0" w:color="D4DEE9"/>
+              <w:insideV w:val="single" w:sz="8" w:space="0" w:color="D4DEE9"/>
+            </w:tcBorders>
+            <w:tcMar>
+              <w:top w:w="100" w:type="dxa"/>
+              <w:start w:w="140" w:type="dxa"/>
+              <w:bottom w:w="100" w:type="dxa"/>
+              <w:end w:w="140" w:type="dxa"/>
+            </w:tcMar>
+            <w:vAlign w:val="center"/>
+          </w:tcPr>
+          <w:p>
+            <w:pPr>
+              <w:spacing w:after="0" w:line="264" w:lineRule="auto"/>
+            </w:pPr>
+            <w:r>
+              <w:rPr>
+                <w:rFonts w:ascii="Microsoft YaHei" w:hAnsi="Microsoft YaHei" w:eastAsia="Microsoft YaHei"/>
+                <w:b w:val="0"/>
+                <w:color w:val="172233"/>
+                <w:sz w:val="18"/>
+              </w:rPr>
+              <w:t>同一连续语音段使用同一个 segment_id；partial latest-wins，final 优先，段落关闭后形成稳定原文。</w:t>
+            </w:r>
+          </w:p>
+        </w:tc>
+      </w:tr>
+      <w:tr>
+        <w:trPr>
+          <w:cantSplit/>
+        </w:trPr>
+        <w:tc>
+          <w:tcPr>
+            <w:tcW w:type="dxa" w:w="1800"/>
+            <w:tcBorders>
+              <w:top w:val="single" w:sz="8" w:space="0" w:color="D4DEE9"/>
+              <w:left w:val="single" w:sz="8" w:space="0" w:color="D4DEE9"/>
+              <w:bottom w:val="single" w:sz="8" w:space="0" w:color="D4DEE9"/>
+              <w:right w:val="single" w:sz="8" w:space="0" w:color="D4DEE9"/>
+              <w:insideH w:val="single" w:sz="8" w:space="0" w:color="D4DEE9"/>
+              <w:insideV w:val="single" w:sz="8" w:space="0" w:color="D4DEE9"/>
+            </w:tcBorders>
+            <w:tcMar>
+              <w:top w:w="100" w:type="dxa"/>
+              <w:start w:w="140" w:type="dxa"/>
+              <w:bottom w:w="100" w:type="dxa"/>
+              <w:end w:w="140" w:type="dxa"/>
+            </w:tcMar>
+            <w:shd w:fill="F7FAFC"/>
+            <w:vAlign w:val="center"/>
+          </w:tcPr>
+          <w:p>
+            <w:pPr>
+              <w:spacing w:after="0" w:line="264" w:lineRule="auto"/>
+            </w:pPr>
+            <w:r>
+              <w:rPr>
+                <w:rFonts w:ascii="Microsoft YaHei" w:hAnsi="Microsoft YaHei" w:eastAsia="Microsoft YaHei"/>
+                <w:b/>
+                <w:color w:val="172233"/>
+                <w:sz w:val="18"/>
+              </w:rPr>
+              <w:t>低质量诊断</w:t>
+            </w:r>
+          </w:p>
+        </w:tc>
+        <w:tc>
+          <w:tcPr>
+            <w:tcW w:type="dxa" w:w="8640"/>
+            <w:tcBorders>
+              <w:top w:val="single" w:sz="8" w:space="0" w:color="D4DEE9"/>
+              <w:left w:val="single" w:sz="8" w:space="0" w:color="D4DEE9"/>
+              <w:bottom w:val="single" w:sz="8" w:space="0" w:color="D4DEE9"/>
+              <w:right w:val="single" w:sz="8" w:space="0" w:color="D4DEE9"/>
+              <w:insideH w:val="single" w:sz="8" w:space="0" w:color="D4DEE9"/>
+              <w:insideV w:val="single" w:sz="8" w:space="0" w:color="D4DEE9"/>
+            </w:tcBorders>
+            <w:tcMar>
+              <w:top w:w="100" w:type="dxa"/>
+              <w:start w:w="140" w:type="dxa"/>
+              <w:bottom w:w="100" w:type="dxa"/>
+              <w:end w:w="140" w:type="dxa"/>
+            </w:tcMar>
+            <w:shd w:fill="F7FAFC"/>
+            <w:vAlign w:val="center"/>
+          </w:tcPr>
+          <w:p>
+            <w:pPr>
+              <w:spacing w:after="0" w:line="264" w:lineRule="auto"/>
+            </w:pPr>
+            <w:r>
+              <w:rPr>
+                <w:rFonts w:ascii="Microsoft YaHei" w:hAnsi="Microsoft YaHei" w:eastAsia="Microsoft YaHei"/>
+                <w:b w:val="0"/>
+                <w:color w:val="172233"/>
+                <w:sz w:val="18"/>
+              </w:rPr>
+              <w:t>最终段记录首轮/重试文本、质量信号、触发原因和是否替换；同时同步 VAD 开段、admission 与事件计数，便于定位空输出和未成段。</w:t>
             </w:r>
           </w:p>
         </w:tc>
@@ -2484,7 +2777,7 @@
                 <w:color w:val="172233"/>
                 <w:sz w:val="18"/>
               </w:rPr>
-              <w:t>英文/德文按稳定前缀进入串行翻译队列，前端通过 paragraph_update 原地更新段落卡片。</w:t>
+              <w:t>英文/德文进入本地 OPUS-MT 合并队列；source_revision 防止旧结果回写，前端通过 paragraph_update 原地更新段落卡片。</w:t>
             </w:r>
           </w:p>
         </w:tc>
@@ -2537,7 +2830,7 @@
         <w:rPr>
           <w:rFonts w:ascii="Microsoft YaHei" w:hAnsi="Microsoft YaHei" w:eastAsia="Microsoft YaHei"/>
         </w:rPr>
-        <w:t>在录音前打开“录音与识别设置”，选择实时识别架构，确认输入设备和背景声过滤。</w:t>
+        <w:t>在录音前打开“录音与识别设置”，确认输入设备和背景声过滤；实时识别固定使用 Qwen3-ASR-1.7B，不再选择模型架构。</w:t>
       </w:r>
     </w:p>
     <w:p>
@@ -2559,7 +2852,7 @@
         <w:rPr>
           <w:rFonts w:ascii="Microsoft YaHei" w:hAnsi="Microsoft YaHei" w:eastAsia="Microsoft YaHei"/>
         </w:rPr>
-        <w:t>停录后，系统依次完成最后音频 flush、实时 ASR、翻译队列和本地保存，并将会议推进到可生成纪要的状态。</w:t>
+        <w:t>停录后，系统依次完成最后音频 flush、最终 ASR、实时翻译队列和本地保存；默认不自动执行会后本地复译，然后将会议推进到可生成纪要的状态。</w:t>
       </w:r>
     </w:p>
     <w:p>
@@ -2976,7 +3269,7 @@
                 <w:color w:val="172233"/>
                 <w:sz w:val="18"/>
               </w:rPr>
-              <w:t>模型架构、输入设备、背景声过滤、静音结束阈值、实时刷新间隔、录音分段长度和录音保留。</w:t>
+              <w:t>固定单一 Qwen 1.7B 识别链路；输入设备、背景声过滤、静音结束阈值、实时刷新间隔、录音分段长度和录音保留。</w:t>
             </w:r>
           </w:p>
         </w:tc>
@@ -3329,7 +3622,7 @@
                 <w:color w:val="172233"/>
                 <w:sz w:val="19"/>
               </w:rPr>
-              <w:t>稳定前缀翻译</w:t>
+              <w:t>语言切换重切片</w:t>
             </w:r>
           </w:p>
         </w:tc>
@@ -3363,7 +3656,7 @@
                 <w:color w:val="172233"/>
                 <w:sz w:val="19"/>
               </w:rPr>
-              <w:t>只翻译已经稳定的原文前缀，过期 source_revision 结果不会覆盖更新后的内容。</w:t>
+              <w:t>确认切换时间后依据时间戳重切旧/新窗口，减少混合 chunk 的漏字、重复和错序。</w:t>
             </w:r>
           </w:p>
         </w:tc>
@@ -3403,7 +3696,7 @@
                 <w:color w:val="172233"/>
                 <w:sz w:val="19"/>
               </w:rPr>
-              <w:t>串行队列与重试</w:t>
+              <w:t>segment_id 合并队列</w:t>
             </w:r>
           </w:p>
         </w:tc>
@@ -3438,7 +3731,7 @@
                 <w:color w:val="172233"/>
                 <w:sz w:val="19"/>
               </w:rPr>
-              <w:t>翻译任务按段落顺序执行；持续失败保留原文，并可调用 translation/retry。</w:t>
+              <w:t>同一段落只保留最新翻译任务；partial 翻译可被 final 覆盖，避免过期文本排队。</w:t>
             </w:r>
           </w:p>
         </w:tc>
@@ -3477,6 +3770,80 @@
                 <w:color w:val="172233"/>
                 <w:sz w:val="19"/>
               </w:rPr>
+              <w:t>source_revision 校验</w:t>
+            </w:r>
+          </w:p>
+        </w:tc>
+        <w:tc>
+          <w:tcPr>
+            <w:tcW w:type="dxa" w:w="7920"/>
+            <w:tcBorders>
+              <w:top w:val="single" w:sz="8" w:space="0" w:color="D4DEE9"/>
+              <w:left w:val="single" w:sz="8" w:space="0" w:color="D4DEE9"/>
+              <w:bottom w:val="single" w:sz="8" w:space="0" w:color="D4DEE9"/>
+              <w:right w:val="single" w:sz="8" w:space="0" w:color="D4DEE9"/>
+              <w:insideH w:val="single" w:sz="8" w:space="0" w:color="D4DEE9"/>
+              <w:insideV w:val="single" w:sz="8" w:space="0" w:color="D4DEE9"/>
+            </w:tcBorders>
+            <w:tcMar>
+              <w:top w:w="100" w:type="dxa"/>
+              <w:start w:w="140" w:type="dxa"/>
+              <w:bottom w:w="100" w:type="dxa"/>
+              <w:end w:w="140" w:type="dxa"/>
+            </w:tcMar>
+            <w:vAlign w:val="center"/>
+          </w:tcPr>
+          <w:p>
+            <w:pPr>
+              <w:spacing w:after="0" w:line="264" w:lineRule="auto"/>
+            </w:pPr>
+            <w:r>
+              <w:rPr>
+                <w:rFonts w:ascii="Microsoft YaHei" w:hAnsi="Microsoft YaHei" w:eastAsia="Microsoft YaHei"/>
+                <w:b w:val="0"/>
+                <w:color w:val="172233"/>
+                <w:sz w:val="19"/>
+              </w:rPr>
+              <w:t>翻译结果写回前校验源文本版本；旧结果不能覆盖新文本，失败时保留原文并可调用 translation/retry。</w:t>
+            </w:r>
+          </w:p>
+        </w:tc>
+      </w:tr>
+      <w:tr>
+        <w:trPr>
+          <w:cantSplit/>
+        </w:trPr>
+        <w:tc>
+          <w:tcPr>
+            <w:tcW w:type="dxa" w:w="2520"/>
+            <w:tcBorders>
+              <w:top w:val="single" w:sz="8" w:space="0" w:color="D4DEE9"/>
+              <w:left w:val="single" w:sz="8" w:space="0" w:color="D4DEE9"/>
+              <w:bottom w:val="single" w:sz="8" w:space="0" w:color="D4DEE9"/>
+              <w:right w:val="single" w:sz="8" w:space="0" w:color="D4DEE9"/>
+              <w:insideH w:val="single" w:sz="8" w:space="0" w:color="D4DEE9"/>
+              <w:insideV w:val="single" w:sz="8" w:space="0" w:color="D4DEE9"/>
+            </w:tcBorders>
+            <w:tcMar>
+              <w:top w:w="100" w:type="dxa"/>
+              <w:start w:w="140" w:type="dxa"/>
+              <w:bottom w:w="100" w:type="dxa"/>
+              <w:end w:w="140" w:type="dxa"/>
+            </w:tcMar>
+            <w:shd w:fill="F7FAFC"/>
+            <w:vAlign w:val="center"/>
+          </w:tcPr>
+          <w:p>
+            <w:pPr>
+              <w:spacing w:after="0" w:line="264" w:lineRule="auto"/>
+            </w:pPr>
+            <w:r>
+              <w:rPr>
+                <w:rFonts w:ascii="Microsoft YaHei" w:hAnsi="Microsoft YaHei" w:eastAsia="Microsoft YaHei"/>
+                <w:b/>
+                <w:color w:val="172233"/>
+                <w:sz w:val="19"/>
+              </w:rPr>
               <w:t>schema 2.0</w:t>
             </w:r>
           </w:p>
@@ -3498,6 +3865,7 @@
               <w:bottom w:w="100" w:type="dxa"/>
               <w:end w:w="140" w:type="dxa"/>
             </w:tcMar>
+            <w:shd w:fill="F7FAFC"/>
             <w:vAlign w:val="center"/>
           </w:tcPr>
           <w:p>
@@ -3582,7 +3950,7 @@
                 <w:color w:val="172233"/>
                 <w:sz w:val="20"/>
               </w:rPr>
-              <w:t>flush 最后音频段 → 等待实时 ASR → 等待翻译队列 → recording_state=complete → ready_for_summary。只有完成翻译队列后，右侧才开放生成纪要和 To-do-list。</w:t>
+              <w:t>flush 最后音频段 → 等待最终 ASR → 等待实时翻译队列 → 跳过默认关闭的会后本地复译 → recording_state=complete → ready_for_summary。只有完成实时翻译队列后，右侧才开放生成纪要和 To-do-list。</w:t>
             </w:r>
           </w:p>
         </w:tc>
@@ -3607,7 +3975,7 @@
         <w:rPr>
           <w:rFonts w:ascii="Microsoft YaHei" w:hAnsi="Microsoft YaHei" w:eastAsia="Microsoft YaHei"/>
         </w:rPr>
-        <w:t>翻译失败不抹掉原文；会议结果仍可查看，修复服务或模型后可以重新排队翻译。</w:t>
+        <w:t>翻译失败不抹掉原文；会议结果仍可查看，修复服务或模型后可以重新排队翻译。会后如需更高质量，可单独请求外部翻译智能体 API。</w:t>
       </w:r>
     </w:p>
     <w:p>
@@ -4352,7 +4720,7 @@
                 <w:color w:val="172233"/>
                 <w:sz w:val="18"/>
               </w:rPr>
-              <w:t>本机浏览器与本机服务；默认使用本地模型缓存。</w:t>
+              <w:t>本机浏览器与本机服务；默认使用唯一的 Qwen3-ASR-1.7B 本地模型缓存。</w:t>
             </w:r>
           </w:p>
         </w:tc>
@@ -4955,7 +5323,7 @@
                 <w:color w:val="172233"/>
                 <w:sz w:val="18"/>
               </w:rPr>
-              <w:t>Qwen3-ASR-1.7B、Qwen3-ASR-0.6B、FunASR FSMN-VAD 和 OPUS-MT en→zh / de→zh。</w:t>
+              <w:t>Qwen3-ASR-1.7B、FunASR FSMN-VAD 和 OPUS-MT en→zh / de→zh；不再准备或加载 Qwen3-ASR-0.6B。</w:t>
             </w:r>
           </w:p>
         </w:tc>
@@ -5244,7 +5612,7 @@
                 <w:color w:val="172233"/>
                 <w:sz w:val="19"/>
               </w:rPr>
-              <w:t>MEETING_ASR_FALLBACK</w:t>
+              <w:t>MEETING_SINGLE_ASR_MODEL</w:t>
             </w:r>
           </w:p>
         </w:tc>
@@ -5278,7 +5646,7 @@
                 <w:color w:val="172233"/>
                 <w:sz w:val="19"/>
               </w:rPr>
-              <w:t>Qwen/Qwen3-ASR-0.6B</w:t>
+              <w:t>1</w:t>
             </w:r>
           </w:p>
         </w:tc>
@@ -5318,7 +5686,7 @@
                 <w:color w:val="172233"/>
                 <w:sz w:val="19"/>
               </w:rPr>
-              <w:t>MEETING_ASR_LANGUAGE_ID</w:t>
+              <w:t>MEETING_ASR_FALLBACK</w:t>
             </w:r>
           </w:p>
         </w:tc>
@@ -5353,7 +5721,7 @@
                 <w:color w:val="172233"/>
                 <w:sz w:val="19"/>
               </w:rPr>
-              <w:t>Qwen/Qwen3-ASR-0.6B</w:t>
+              <w:t>Qwen/Qwen3-ASR-1.7B（兼容别名，不加载第二模型）</w:t>
             </w:r>
           </w:p>
         </w:tc>
@@ -5392,7 +5760,7 @@
                 <w:color w:val="172233"/>
                 <w:sz w:val="19"/>
               </w:rPr>
-              <w:t>TRANSCRIPT_SCHEMA_VERSION</w:t>
+              <w:t>MEETING_ASR_LANGUAGE_ID</w:t>
             </w:r>
           </w:p>
         </w:tc>
@@ -5426,7 +5794,7 @@
                 <w:color w:val="172233"/>
                 <w:sz w:val="19"/>
               </w:rPr>
-              <w:t>2.0</w:t>
+              <w:t>Qwen/Qwen3-ASR-1.7B（兼容别名，同模确认）</w:t>
             </w:r>
           </w:p>
         </w:tc>
@@ -5466,7 +5834,7 @@
                 <w:color w:val="172233"/>
                 <w:sz w:val="19"/>
               </w:rPr>
-              <w:t>language_id_min_seconds</w:t>
+              <w:t>MEETING_PARTIAL_INTERVAL_MS</w:t>
             </w:r>
           </w:p>
         </w:tc>
@@ -5501,7 +5869,601 @@
                 <w:color w:val="172233"/>
                 <w:sz w:val="19"/>
               </w:rPr>
-              <w:t>0.8 秒左右开始语言/方言判断</w:t>
+              <w:t>默认 1000；实际运行值以 .env / 设置页为准</w:t>
+            </w:r>
+          </w:p>
+        </w:tc>
+      </w:tr>
+      <w:tr>
+        <w:trPr>
+          <w:cantSplit/>
+        </w:trPr>
+        <w:tc>
+          <w:tcPr>
+            <w:tcW w:type="dxa" w:w="3960"/>
+            <w:tcBorders>
+              <w:top w:val="single" w:sz="8" w:space="0" w:color="D4DEE9"/>
+              <w:left w:val="single" w:sz="8" w:space="0" w:color="D4DEE9"/>
+              <w:bottom w:val="single" w:sz="8" w:space="0" w:color="D4DEE9"/>
+              <w:right w:val="single" w:sz="8" w:space="0" w:color="D4DEE9"/>
+              <w:insideH w:val="single" w:sz="8" w:space="0" w:color="D4DEE9"/>
+              <w:insideV w:val="single" w:sz="8" w:space="0" w:color="D4DEE9"/>
+            </w:tcBorders>
+            <w:tcMar>
+              <w:top w:w="100" w:type="dxa"/>
+              <w:start w:w="140" w:type="dxa"/>
+              <w:bottom w:w="100" w:type="dxa"/>
+              <w:end w:w="140" w:type="dxa"/>
+            </w:tcMar>
+            <w:vAlign w:val="center"/>
+          </w:tcPr>
+          <w:p>
+            <w:pPr>
+              <w:spacing w:after="0" w:line="264" w:lineRule="auto"/>
+            </w:pPr>
+            <w:r>
+              <w:rPr>
+                <w:rFonts w:ascii="Microsoft YaHei" w:hAnsi="Microsoft YaHei" w:eastAsia="Microsoft YaHei"/>
+                <w:b/>
+                <w:color w:val="172233"/>
+                <w:sz w:val="19"/>
+              </w:rPr>
+              <w:t>MEETING_LANGUAGE_ID_MIN_SECONDS</w:t>
+            </w:r>
+          </w:p>
+        </w:tc>
+        <w:tc>
+          <w:tcPr>
+            <w:tcW w:type="dxa" w:w="6480"/>
+            <w:tcBorders>
+              <w:top w:val="single" w:sz="8" w:space="0" w:color="D4DEE9"/>
+              <w:left w:val="single" w:sz="8" w:space="0" w:color="D4DEE9"/>
+              <w:bottom w:val="single" w:sz="8" w:space="0" w:color="D4DEE9"/>
+              <w:right w:val="single" w:sz="8" w:space="0" w:color="D4DEE9"/>
+              <w:insideH w:val="single" w:sz="8" w:space="0" w:color="D4DEE9"/>
+              <w:insideV w:val="single" w:sz="8" w:space="0" w:color="D4DEE9"/>
+            </w:tcBorders>
+            <w:tcMar>
+              <w:top w:w="100" w:type="dxa"/>
+              <w:start w:w="140" w:type="dxa"/>
+              <w:bottom w:w="100" w:type="dxa"/>
+              <w:end w:w="140" w:type="dxa"/>
+            </w:tcMar>
+            <w:vAlign w:val="center"/>
+          </w:tcPr>
+          <w:p>
+            <w:pPr>
+              <w:spacing w:after="0" w:line="264" w:lineRule="auto"/>
+            </w:pPr>
+            <w:r>
+              <w:rPr>
+                <w:rFonts w:ascii="Microsoft YaHei" w:hAnsi="Microsoft YaHei" w:eastAsia="Microsoft YaHei"/>
+                <w:b w:val="0"/>
+                <w:color w:val="172233"/>
+                <w:sz w:val="19"/>
+              </w:rPr>
+              <w:t>1.0</w:t>
+            </w:r>
+          </w:p>
+        </w:tc>
+      </w:tr>
+      <w:tr>
+        <w:trPr>
+          <w:cantSplit/>
+        </w:trPr>
+        <w:tc>
+          <w:tcPr>
+            <w:tcW w:type="dxa" w:w="3960"/>
+            <w:tcBorders>
+              <w:top w:val="single" w:sz="8" w:space="0" w:color="D4DEE9"/>
+              <w:left w:val="single" w:sz="8" w:space="0" w:color="D4DEE9"/>
+              <w:bottom w:val="single" w:sz="8" w:space="0" w:color="D4DEE9"/>
+              <w:right w:val="single" w:sz="8" w:space="0" w:color="D4DEE9"/>
+              <w:insideH w:val="single" w:sz="8" w:space="0" w:color="D4DEE9"/>
+              <w:insideV w:val="single" w:sz="8" w:space="0" w:color="D4DEE9"/>
+            </w:tcBorders>
+            <w:tcMar>
+              <w:top w:w="100" w:type="dxa"/>
+              <w:start w:w="140" w:type="dxa"/>
+              <w:bottom w:w="100" w:type="dxa"/>
+              <w:end w:w="140" w:type="dxa"/>
+            </w:tcMar>
+            <w:shd w:fill="F7FAFC"/>
+            <w:vAlign w:val="center"/>
+          </w:tcPr>
+          <w:p>
+            <w:pPr>
+              <w:spacing w:after="0" w:line="264" w:lineRule="auto"/>
+            </w:pPr>
+            <w:r>
+              <w:rPr>
+                <w:rFonts w:ascii="Microsoft YaHei" w:hAnsi="Microsoft YaHei" w:eastAsia="Microsoft YaHei"/>
+                <w:b/>
+                <w:color w:val="172233"/>
+                <w:sz w:val="19"/>
+              </w:rPr>
+              <w:t>MEETING_LANGUAGE_CONFLICT_</w:t>
+              <w:br/>
+              <w:t>CONFIRMATIONS</w:t>
+            </w:r>
+          </w:p>
+        </w:tc>
+        <w:tc>
+          <w:tcPr>
+            <w:tcW w:type="dxa" w:w="6480"/>
+            <w:tcBorders>
+              <w:top w:val="single" w:sz="8" w:space="0" w:color="D4DEE9"/>
+              <w:left w:val="single" w:sz="8" w:space="0" w:color="D4DEE9"/>
+              <w:bottom w:val="single" w:sz="8" w:space="0" w:color="D4DEE9"/>
+              <w:right w:val="single" w:sz="8" w:space="0" w:color="D4DEE9"/>
+              <w:insideH w:val="single" w:sz="8" w:space="0" w:color="D4DEE9"/>
+              <w:insideV w:val="single" w:sz="8" w:space="0" w:color="D4DEE9"/>
+            </w:tcBorders>
+            <w:tcMar>
+              <w:top w:w="100" w:type="dxa"/>
+              <w:start w:w="140" w:type="dxa"/>
+              <w:bottom w:w="100" w:type="dxa"/>
+              <w:end w:w="140" w:type="dxa"/>
+            </w:tcMar>
+            <w:shd w:fill="F7FAFC"/>
+            <w:vAlign w:val="center"/>
+          </w:tcPr>
+          <w:p>
+            <w:pPr>
+              <w:spacing w:after="0" w:line="264" w:lineRule="auto"/>
+            </w:pPr>
+            <w:r>
+              <w:rPr>
+                <w:rFonts w:ascii="Microsoft YaHei" w:hAnsi="Microsoft YaHei" w:eastAsia="Microsoft YaHei"/>
+                <w:b w:val="0"/>
+                <w:color w:val="172233"/>
+                <w:sz w:val="19"/>
+              </w:rPr>
+              <w:t>3</w:t>
+            </w:r>
+          </w:p>
+        </w:tc>
+      </w:tr>
+      <w:tr>
+        <w:trPr>
+          <w:cantSplit/>
+        </w:trPr>
+        <w:tc>
+          <w:tcPr>
+            <w:tcW w:type="dxa" w:w="3960"/>
+            <w:tcBorders>
+              <w:top w:val="single" w:sz="8" w:space="0" w:color="D4DEE9"/>
+              <w:left w:val="single" w:sz="8" w:space="0" w:color="D4DEE9"/>
+              <w:bottom w:val="single" w:sz="8" w:space="0" w:color="D4DEE9"/>
+              <w:right w:val="single" w:sz="8" w:space="0" w:color="D4DEE9"/>
+              <w:insideH w:val="single" w:sz="8" w:space="0" w:color="D4DEE9"/>
+              <w:insideV w:val="single" w:sz="8" w:space="0" w:color="D4DEE9"/>
+            </w:tcBorders>
+            <w:tcMar>
+              <w:top w:w="100" w:type="dxa"/>
+              <w:start w:w="140" w:type="dxa"/>
+              <w:bottom w:w="100" w:type="dxa"/>
+              <w:end w:w="140" w:type="dxa"/>
+            </w:tcMar>
+            <w:vAlign w:val="center"/>
+          </w:tcPr>
+          <w:p>
+            <w:pPr>
+              <w:spacing w:after="0" w:line="264" w:lineRule="auto"/>
+            </w:pPr>
+            <w:r>
+              <w:rPr>
+                <w:rFonts w:ascii="Microsoft YaHei" w:hAnsi="Microsoft YaHei" w:eastAsia="Microsoft YaHei"/>
+                <w:b/>
+                <w:color w:val="172233"/>
+                <w:sz w:val="19"/>
+              </w:rPr>
+              <w:t>MEETING_POST_TRANSLATION_ENABLED</w:t>
+            </w:r>
+          </w:p>
+        </w:tc>
+        <w:tc>
+          <w:tcPr>
+            <w:tcW w:type="dxa" w:w="6480"/>
+            <w:tcBorders>
+              <w:top w:val="single" w:sz="8" w:space="0" w:color="D4DEE9"/>
+              <w:left w:val="single" w:sz="8" w:space="0" w:color="D4DEE9"/>
+              <w:bottom w:val="single" w:sz="8" w:space="0" w:color="D4DEE9"/>
+              <w:right w:val="single" w:sz="8" w:space="0" w:color="D4DEE9"/>
+              <w:insideH w:val="single" w:sz="8" w:space="0" w:color="D4DEE9"/>
+              <w:insideV w:val="single" w:sz="8" w:space="0" w:color="D4DEE9"/>
+            </w:tcBorders>
+            <w:tcMar>
+              <w:top w:w="100" w:type="dxa"/>
+              <w:start w:w="140" w:type="dxa"/>
+              <w:bottom w:w="100" w:type="dxa"/>
+              <w:end w:w="140" w:type="dxa"/>
+            </w:tcMar>
+            <w:vAlign w:val="center"/>
+          </w:tcPr>
+          <w:p>
+            <w:pPr>
+              <w:spacing w:after="0" w:line="264" w:lineRule="auto"/>
+            </w:pPr>
+            <w:r>
+              <w:rPr>
+                <w:rFonts w:ascii="Microsoft YaHei" w:hAnsi="Microsoft YaHei" w:eastAsia="Microsoft YaHei"/>
+                <w:b w:val="0"/>
+                <w:color w:val="172233"/>
+                <w:sz w:val="19"/>
+              </w:rPr>
+              <w:t>0（默认关闭本地会后复译）</w:t>
+            </w:r>
+          </w:p>
+        </w:tc>
+      </w:tr>
+      <w:tr>
+        <w:trPr>
+          <w:cantSplit/>
+        </w:trPr>
+        <w:tc>
+          <w:tcPr>
+            <w:tcW w:type="dxa" w:w="3960"/>
+            <w:tcBorders>
+              <w:top w:val="single" w:sz="8" w:space="0" w:color="D4DEE9"/>
+              <w:left w:val="single" w:sz="8" w:space="0" w:color="D4DEE9"/>
+              <w:bottom w:val="single" w:sz="8" w:space="0" w:color="D4DEE9"/>
+              <w:right w:val="single" w:sz="8" w:space="0" w:color="D4DEE9"/>
+              <w:insideH w:val="single" w:sz="8" w:space="0" w:color="D4DEE9"/>
+              <w:insideV w:val="single" w:sz="8" w:space="0" w:color="D4DEE9"/>
+            </w:tcBorders>
+            <w:tcMar>
+              <w:top w:w="100" w:type="dxa"/>
+              <w:start w:w="140" w:type="dxa"/>
+              <w:bottom w:w="100" w:type="dxa"/>
+              <w:end w:w="140" w:type="dxa"/>
+            </w:tcMar>
+            <w:shd w:fill="F7FAFC"/>
+            <w:vAlign w:val="center"/>
+          </w:tcPr>
+          <w:p>
+            <w:pPr>
+              <w:spacing w:after="0" w:line="264" w:lineRule="auto"/>
+            </w:pPr>
+            <w:r>
+              <w:rPr>
+                <w:rFonts w:ascii="Microsoft YaHei" w:hAnsi="Microsoft YaHei" w:eastAsia="Microsoft YaHei"/>
+                <w:b/>
+                <w:color w:val="172233"/>
+                <w:sz w:val="19"/>
+              </w:rPr>
+              <w:t>MEETING_ASR_SECONDARY_RETRY_ENABLED</w:t>
+            </w:r>
+          </w:p>
+        </w:tc>
+        <w:tc>
+          <w:tcPr>
+            <w:tcW w:type="dxa" w:w="6480"/>
+            <w:tcBorders>
+              <w:top w:val="single" w:sz="8" w:space="0" w:color="D4DEE9"/>
+              <w:left w:val="single" w:sz="8" w:space="0" w:color="D4DEE9"/>
+              <w:bottom w:val="single" w:sz="8" w:space="0" w:color="D4DEE9"/>
+              <w:right w:val="single" w:sz="8" w:space="0" w:color="D4DEE9"/>
+              <w:insideH w:val="single" w:sz="8" w:space="0" w:color="D4DEE9"/>
+              <w:insideV w:val="single" w:sz="8" w:space="0" w:color="D4DEE9"/>
+            </w:tcBorders>
+            <w:tcMar>
+              <w:top w:w="100" w:type="dxa"/>
+              <w:start w:w="140" w:type="dxa"/>
+              <w:bottom w:w="100" w:type="dxa"/>
+              <w:end w:w="140" w:type="dxa"/>
+            </w:tcMar>
+            <w:shd w:fill="F7FAFC"/>
+            <w:vAlign w:val="center"/>
+          </w:tcPr>
+          <w:p>
+            <w:pPr>
+              <w:spacing w:after="0" w:line="264" w:lineRule="auto"/>
+            </w:pPr>
+            <w:r>
+              <w:rPr>
+                <w:rFonts w:ascii="Microsoft YaHei" w:hAnsi="Microsoft YaHei" w:eastAsia="Microsoft YaHei"/>
+                <w:b w:val="0"/>
+                <w:color w:val="172233"/>
+                <w:sz w:val="19"/>
+              </w:rPr>
+              <w:t>1（默认开启；同模二次识别）</w:t>
+            </w:r>
+          </w:p>
+        </w:tc>
+      </w:tr>
+      <w:tr>
+        <w:trPr>
+          <w:cantSplit/>
+        </w:trPr>
+        <w:tc>
+          <w:tcPr>
+            <w:tcW w:type="dxa" w:w="3960"/>
+            <w:tcBorders>
+              <w:top w:val="single" w:sz="8" w:space="0" w:color="D4DEE9"/>
+              <w:left w:val="single" w:sz="8" w:space="0" w:color="D4DEE9"/>
+              <w:bottom w:val="single" w:sz="8" w:space="0" w:color="D4DEE9"/>
+              <w:right w:val="single" w:sz="8" w:space="0" w:color="D4DEE9"/>
+              <w:insideH w:val="single" w:sz="8" w:space="0" w:color="D4DEE9"/>
+              <w:insideV w:val="single" w:sz="8" w:space="0" w:color="D4DEE9"/>
+            </w:tcBorders>
+            <w:tcMar>
+              <w:top w:w="100" w:type="dxa"/>
+              <w:start w:w="140" w:type="dxa"/>
+              <w:bottom w:w="100" w:type="dxa"/>
+              <w:end w:w="140" w:type="dxa"/>
+            </w:tcMar>
+            <w:vAlign w:val="center"/>
+          </w:tcPr>
+          <w:p>
+            <w:pPr>
+              <w:spacing w:after="0" w:line="264" w:lineRule="auto"/>
+            </w:pPr>
+            <w:r>
+              <w:rPr>
+                <w:rFonts w:ascii="Microsoft YaHei" w:hAnsi="Microsoft YaHei" w:eastAsia="Microsoft YaHei"/>
+                <w:b/>
+                <w:color w:val="172233"/>
+                <w:sz w:val="19"/>
+              </w:rPr>
+              <w:t>MEETING_ASR_SECONDARY_RETRY_SHORT_SECONDS</w:t>
+            </w:r>
+          </w:p>
+        </w:tc>
+        <w:tc>
+          <w:tcPr>
+            <w:tcW w:type="dxa" w:w="6480"/>
+            <w:tcBorders>
+              <w:top w:val="single" w:sz="8" w:space="0" w:color="D4DEE9"/>
+              <w:left w:val="single" w:sz="8" w:space="0" w:color="D4DEE9"/>
+              <w:bottom w:val="single" w:sz="8" w:space="0" w:color="D4DEE9"/>
+              <w:right w:val="single" w:sz="8" w:space="0" w:color="D4DEE9"/>
+              <w:insideH w:val="single" w:sz="8" w:space="0" w:color="D4DEE9"/>
+              <w:insideV w:val="single" w:sz="8" w:space="0" w:color="D4DEE9"/>
+            </w:tcBorders>
+            <w:tcMar>
+              <w:top w:w="100" w:type="dxa"/>
+              <w:start w:w="140" w:type="dxa"/>
+              <w:bottom w:w="100" w:type="dxa"/>
+              <w:end w:w="140" w:type="dxa"/>
+            </w:tcMar>
+            <w:vAlign w:val="center"/>
+          </w:tcPr>
+          <w:p>
+            <w:pPr>
+              <w:spacing w:after="0" w:line="264" w:lineRule="auto"/>
+            </w:pPr>
+            <w:r>
+              <w:rPr>
+                <w:rFonts w:ascii="Microsoft YaHei" w:hAnsi="Microsoft YaHei" w:eastAsia="Microsoft YaHei"/>
+                <w:b w:val="0"/>
+                <w:color w:val="172233"/>
+                <w:sz w:val="19"/>
+              </w:rPr>
+              <w:t>1.8（短段触发阈值，可按会议调整）</w:t>
+            </w:r>
+          </w:p>
+        </w:tc>
+      </w:tr>
+      <w:tr>
+        <w:trPr>
+          <w:cantSplit/>
+        </w:trPr>
+        <w:tc>
+          <w:tcPr>
+            <w:tcW w:type="dxa" w:w="3960"/>
+            <w:tcBorders>
+              <w:top w:val="single" w:sz="8" w:space="0" w:color="D4DEE9"/>
+              <w:left w:val="single" w:sz="8" w:space="0" w:color="D4DEE9"/>
+              <w:bottom w:val="single" w:sz="8" w:space="0" w:color="D4DEE9"/>
+              <w:right w:val="single" w:sz="8" w:space="0" w:color="D4DEE9"/>
+              <w:insideH w:val="single" w:sz="8" w:space="0" w:color="D4DEE9"/>
+              <w:insideV w:val="single" w:sz="8" w:space="0" w:color="D4DEE9"/>
+            </w:tcBorders>
+            <w:tcMar>
+              <w:top w:w="100" w:type="dxa"/>
+              <w:start w:w="140" w:type="dxa"/>
+              <w:bottom w:w="100" w:type="dxa"/>
+              <w:end w:w="140" w:type="dxa"/>
+            </w:tcMar>
+            <w:shd w:fill="F7FAFC"/>
+            <w:vAlign w:val="center"/>
+          </w:tcPr>
+          <w:p>
+            <w:pPr>
+              <w:spacing w:after="0" w:line="264" w:lineRule="auto"/>
+            </w:pPr>
+            <w:r>
+              <w:rPr>
+                <w:rFonts w:ascii="Microsoft YaHei" w:hAnsi="Microsoft YaHei" w:eastAsia="Microsoft YaHei"/>
+                <w:b/>
+                <w:color w:val="172233"/>
+                <w:sz w:val="19"/>
+              </w:rPr>
+              <w:t>MEETING_ASR_SECONDARY_RETRY_CONFIDENCE_THRESHOLD</w:t>
+            </w:r>
+          </w:p>
+        </w:tc>
+        <w:tc>
+          <w:tcPr>
+            <w:tcW w:type="dxa" w:w="6480"/>
+            <w:tcBorders>
+              <w:top w:val="single" w:sz="8" w:space="0" w:color="D4DEE9"/>
+              <w:left w:val="single" w:sz="8" w:space="0" w:color="D4DEE9"/>
+              <w:bottom w:val="single" w:sz="8" w:space="0" w:color="D4DEE9"/>
+              <w:right w:val="single" w:sz="8" w:space="0" w:color="D4DEE9"/>
+              <w:insideH w:val="single" w:sz="8" w:space="0" w:color="D4DEE9"/>
+              <w:insideV w:val="single" w:sz="8" w:space="0" w:color="D4DEE9"/>
+            </w:tcBorders>
+            <w:tcMar>
+              <w:top w:w="100" w:type="dxa"/>
+              <w:start w:w="140" w:type="dxa"/>
+              <w:bottom w:w="100" w:type="dxa"/>
+              <w:end w:w="140" w:type="dxa"/>
+            </w:tcMar>
+            <w:shd w:fill="F7FAFC"/>
+            <w:vAlign w:val="center"/>
+          </w:tcPr>
+          <w:p>
+            <w:pPr>
+              <w:spacing w:after="0" w:line="264" w:lineRule="auto"/>
+            </w:pPr>
+            <w:r>
+              <w:rPr>
+                <w:rFonts w:ascii="Microsoft YaHei" w:hAnsi="Microsoft YaHei" w:eastAsia="Microsoft YaHei"/>
+                <w:b w:val="0"/>
+                <w:color w:val="172233"/>
+                <w:sz w:val="19"/>
+              </w:rPr>
+              <w:t>0.42（置信度触发阈值）</w:t>
+            </w:r>
+          </w:p>
+        </w:tc>
+      </w:tr>
+      <w:tr>
+        <w:trPr>
+          <w:cantSplit/>
+        </w:trPr>
+        <w:tc>
+          <w:tcPr>
+            <w:tcW w:type="dxa" w:w="3960"/>
+            <w:tcBorders>
+              <w:top w:val="single" w:sz="8" w:space="0" w:color="D4DEE9"/>
+              <w:left w:val="single" w:sz="8" w:space="0" w:color="D4DEE9"/>
+              <w:bottom w:val="single" w:sz="8" w:space="0" w:color="D4DEE9"/>
+              <w:right w:val="single" w:sz="8" w:space="0" w:color="D4DEE9"/>
+              <w:insideH w:val="single" w:sz="8" w:space="0" w:color="D4DEE9"/>
+              <w:insideV w:val="single" w:sz="8" w:space="0" w:color="D4DEE9"/>
+            </w:tcBorders>
+            <w:tcMar>
+              <w:top w:w="100" w:type="dxa"/>
+              <w:start w:w="140" w:type="dxa"/>
+              <w:bottom w:w="100" w:type="dxa"/>
+              <w:end w:w="140" w:type="dxa"/>
+            </w:tcMar>
+            <w:vAlign w:val="center"/>
+          </w:tcPr>
+          <w:p>
+            <w:pPr>
+              <w:spacing w:after="0" w:line="264" w:lineRule="auto"/>
+            </w:pPr>
+            <w:r>
+              <w:rPr>
+                <w:rFonts w:ascii="Microsoft YaHei" w:hAnsi="Microsoft YaHei" w:eastAsia="Microsoft YaHei"/>
+                <w:b/>
+                <w:color w:val="172233"/>
+                <w:sz w:val="19"/>
+              </w:rPr>
+              <w:t>MEETING_ASR_SECONDARY_RETRY_QUALITY_THRESHOLD</w:t>
+            </w:r>
+          </w:p>
+        </w:tc>
+        <w:tc>
+          <w:tcPr>
+            <w:tcW w:type="dxa" w:w="6480"/>
+            <w:tcBorders>
+              <w:top w:val="single" w:sz="8" w:space="0" w:color="D4DEE9"/>
+              <w:left w:val="single" w:sz="8" w:space="0" w:color="D4DEE9"/>
+              <w:bottom w:val="single" w:sz="8" w:space="0" w:color="D4DEE9"/>
+              <w:right w:val="single" w:sz="8" w:space="0" w:color="D4DEE9"/>
+              <w:insideH w:val="single" w:sz="8" w:space="0" w:color="D4DEE9"/>
+              <w:insideV w:val="single" w:sz="8" w:space="0" w:color="D4DEE9"/>
+            </w:tcBorders>
+            <w:tcMar>
+              <w:top w:w="100" w:type="dxa"/>
+              <w:start w:w="140" w:type="dxa"/>
+              <w:bottom w:w="100" w:type="dxa"/>
+              <w:end w:w="140" w:type="dxa"/>
+            </w:tcMar>
+            <w:vAlign w:val="center"/>
+          </w:tcPr>
+          <w:p>
+            <w:pPr>
+              <w:spacing w:after="0" w:line="264" w:lineRule="auto"/>
+            </w:pPr>
+            <w:r>
+              <w:rPr>
+                <w:rFonts w:ascii="Microsoft YaHei" w:hAnsi="Microsoft YaHei" w:eastAsia="Microsoft YaHei"/>
+                <w:b w:val="0"/>
+                <w:color w:val="172233"/>
+                <w:sz w:val="19"/>
+              </w:rPr>
+              <w:t>0.50（文本质量触发阈值）</w:t>
+            </w:r>
+          </w:p>
+        </w:tc>
+      </w:tr>
+      <w:tr>
+        <w:trPr>
+          <w:cantSplit/>
+        </w:trPr>
+        <w:tc>
+          <w:tcPr>
+            <w:tcW w:type="dxa" w:w="3960"/>
+            <w:tcBorders>
+              <w:top w:val="single" w:sz="8" w:space="0" w:color="D4DEE9"/>
+              <w:left w:val="single" w:sz="8" w:space="0" w:color="D4DEE9"/>
+              <w:bottom w:val="single" w:sz="8" w:space="0" w:color="D4DEE9"/>
+              <w:right w:val="single" w:sz="8" w:space="0" w:color="D4DEE9"/>
+              <w:insideH w:val="single" w:sz="8" w:space="0" w:color="D4DEE9"/>
+              <w:insideV w:val="single" w:sz="8" w:space="0" w:color="D4DEE9"/>
+            </w:tcBorders>
+            <w:tcMar>
+              <w:top w:w="100" w:type="dxa"/>
+              <w:start w:w="140" w:type="dxa"/>
+              <w:bottom w:w="100" w:type="dxa"/>
+              <w:end w:w="140" w:type="dxa"/>
+            </w:tcMar>
+            <w:shd w:fill="F7FAFC"/>
+            <w:vAlign w:val="center"/>
+          </w:tcPr>
+          <w:p>
+            <w:pPr>
+              <w:spacing w:after="0" w:line="264" w:lineRule="auto"/>
+            </w:pPr>
+            <w:r>
+              <w:rPr>
+                <w:rFonts w:ascii="Microsoft YaHei" w:hAnsi="Microsoft YaHei" w:eastAsia="Microsoft YaHei"/>
+                <w:b/>
+                <w:color w:val="172233"/>
+                <w:sz w:val="19"/>
+              </w:rPr>
+              <w:t>TRANSCRIPT_SCHEMA_VERSION</w:t>
+            </w:r>
+          </w:p>
+        </w:tc>
+        <w:tc>
+          <w:tcPr>
+            <w:tcW w:type="dxa" w:w="6480"/>
+            <w:tcBorders>
+              <w:top w:val="single" w:sz="8" w:space="0" w:color="D4DEE9"/>
+              <w:left w:val="single" w:sz="8" w:space="0" w:color="D4DEE9"/>
+              <w:bottom w:val="single" w:sz="8" w:space="0" w:color="D4DEE9"/>
+              <w:right w:val="single" w:sz="8" w:space="0" w:color="D4DEE9"/>
+              <w:insideH w:val="single" w:sz="8" w:space="0" w:color="D4DEE9"/>
+              <w:insideV w:val="single" w:sz="8" w:space="0" w:color="D4DEE9"/>
+            </w:tcBorders>
+            <w:tcMar>
+              <w:top w:w="100" w:type="dxa"/>
+              <w:start w:w="140" w:type="dxa"/>
+              <w:bottom w:w="100" w:type="dxa"/>
+              <w:end w:w="140" w:type="dxa"/>
+            </w:tcMar>
+            <w:shd w:fill="F7FAFC"/>
+            <w:vAlign w:val="center"/>
+          </w:tcPr>
+          <w:p>
+            <w:pPr>
+              <w:spacing w:after="0" w:line="264" w:lineRule="auto"/>
+            </w:pPr>
+            <w:r>
+              <w:rPr>
+                <w:rFonts w:ascii="Microsoft YaHei" w:hAnsi="Microsoft YaHei" w:eastAsia="Microsoft YaHei"/>
+                <w:b w:val="0"/>
+                <w:color w:val="172233"/>
+                <w:sz w:val="19"/>
+              </w:rPr>
+              <w:t>2.0</w:t>
             </w:r>
           </w:p>
         </w:tc>
@@ -5687,7 +6649,7 @@
                 <w:color w:val="172233"/>
                 <w:sz w:val="18"/>
               </w:rPr>
-              <w:t>移除旧 Whisper、large-v3、Resemblyzer 和会后第二套 ASR 的产品描述，统一改为 Qwen3-ASR 双模型架构。</w:t>
+              <w:t>移除旧 Whisper、large-v3、Resemblyzer、0.6B 第二模型和会后第二套 ASR 的产品描述，统一改为 Qwen3-ASR-1.7B 单模型架构。</w:t>
             </w:r>
           </w:p>
         </w:tc>
@@ -5760,7 +6722,7 @@
                 <w:color w:val="172233"/>
                 <w:sz w:val="18"/>
               </w:rPr>
-              <w:t>明确区分“质量优先”和“低延迟”两套架构，说明主识别、语言/方言判断与 fallback，不再暗示全程只用一种模型。</w:t>
+              <w:t>取消两套实时架构选择，明确 Qwen3-ASR-1.7B 同时承担主识别、语言/方言确认和冲突重识别；旧配置字段仅作兼容别名。</w:t>
             </w:r>
           </w:p>
         </w:tc>
@@ -5988,6 +6950,154 @@
           </w:p>
         </w:tc>
       </w:tr>
+      <w:tr>
+        <w:trPr>
+          <w:cantSplit/>
+        </w:trPr>
+        <w:tc>
+          <w:tcPr>
+            <w:tcW w:type="dxa" w:w="2088"/>
+            <w:tcBorders>
+              <w:top w:val="single" w:sz="8" w:space="0" w:color="D4DEE9"/>
+              <w:left w:val="single" w:sz="8" w:space="0" w:color="D4DEE9"/>
+              <w:bottom w:val="single" w:sz="8" w:space="0" w:color="D4DEE9"/>
+              <w:right w:val="single" w:sz="8" w:space="0" w:color="D4DEE9"/>
+              <w:insideH w:val="single" w:sz="8" w:space="0" w:color="D4DEE9"/>
+              <w:insideV w:val="single" w:sz="8" w:space="0" w:color="D4DEE9"/>
+            </w:tcBorders>
+            <w:tcMar>
+              <w:top w:w="100" w:type="dxa"/>
+              <w:start w:w="140" w:type="dxa"/>
+              <w:bottom w:w="100" w:type="dxa"/>
+              <w:end w:w="140" w:type="dxa"/>
+            </w:tcMar>
+            <w:vAlign w:val="center"/>
+          </w:tcPr>
+          <w:p>
+            <w:pPr>
+              <w:spacing w:after="0" w:line="264" w:lineRule="auto"/>
+            </w:pPr>
+            <w:r>
+              <w:rPr>
+                <w:rFonts w:ascii="Microsoft YaHei" w:hAnsi="Microsoft YaHei" w:eastAsia="Microsoft YaHei"/>
+                <w:b/>
+                <w:color w:val="172233"/>
+                <w:sz w:val="18"/>
+              </w:rPr>
+              <w:t>实时回放测试</w:t>
+            </w:r>
+          </w:p>
+        </w:tc>
+        <w:tc>
+          <w:tcPr>
+            <w:tcW w:type="dxa" w:w="8352"/>
+            <w:tcBorders>
+              <w:top w:val="single" w:sz="8" w:space="0" w:color="D4DEE9"/>
+              <w:left w:val="single" w:sz="8" w:space="0" w:color="D4DEE9"/>
+              <w:bottom w:val="single" w:sz="8" w:space="0" w:color="D4DEE9"/>
+              <w:right w:val="single" w:sz="8" w:space="0" w:color="D4DEE9"/>
+              <w:insideH w:val="single" w:sz="8" w:space="0" w:color="D4DEE9"/>
+              <w:insideV w:val="single" w:sz="8" w:space="0" w:color="D4DEE9"/>
+            </w:tcBorders>
+            <w:tcMar>
+              <w:top w:w="100" w:type="dxa"/>
+              <w:start w:w="140" w:type="dxa"/>
+              <w:bottom w:w="100" w:type="dxa"/>
+              <w:end w:w="140" w:type="dxa"/>
+            </w:tcMar>
+            <w:vAlign w:val="center"/>
+          </w:tcPr>
+          <w:p>
+            <w:pPr>
+              <w:spacing w:after="0" w:line="264" w:lineRule="auto"/>
+            </w:pPr>
+            <w:r>
+              <w:rPr>
+                <w:rFonts w:ascii="Microsoft YaHei" w:hAnsi="Microsoft YaHei" w:eastAsia="Microsoft YaHei"/>
+                <w:b w:val="0"/>
+                <w:color w:val="172233"/>
+                <w:sz w:val="18"/>
+              </w:rPr>
+              <w:t>项目内保留制造业月会音频、文字稿、manifest 和流程说明；按 1.0 倍速模拟实时输入，回放结束后依次请求会议纪要与 To-do API，并对比识别、翻译和接口结果。</w:t>
+            </w:r>
+          </w:p>
+        </w:tc>
+      </w:tr>
+      <w:tr>
+        <w:trPr>
+          <w:cantSplit/>
+        </w:trPr>
+        <w:tc>
+          <w:tcPr>
+            <w:tcW w:type="dxa" w:w="2088"/>
+            <w:tcBorders>
+              <w:top w:val="single" w:sz="8" w:space="0" w:color="D4DEE9"/>
+              <w:left w:val="single" w:sz="8" w:space="0" w:color="D4DEE9"/>
+              <w:bottom w:val="single" w:sz="8" w:space="0" w:color="D4DEE9"/>
+              <w:right w:val="single" w:sz="8" w:space="0" w:color="D4DEE9"/>
+              <w:insideH w:val="single" w:sz="8" w:space="0" w:color="D4DEE9"/>
+              <w:insideV w:val="single" w:sz="8" w:space="0" w:color="D4DEE9"/>
+            </w:tcBorders>
+            <w:tcMar>
+              <w:top w:w="100" w:type="dxa"/>
+              <w:start w:w="140" w:type="dxa"/>
+              <w:bottom w:w="100" w:type="dxa"/>
+              <w:end w:w="140" w:type="dxa"/>
+            </w:tcMar>
+            <w:shd w:fill="F7FAFC"/>
+            <w:vAlign w:val="center"/>
+          </w:tcPr>
+          <w:p>
+            <w:pPr>
+              <w:spacing w:after="0" w:line="264" w:lineRule="auto"/>
+            </w:pPr>
+            <w:r>
+              <w:rPr>
+                <w:rFonts w:ascii="Microsoft YaHei" w:hAnsi="Microsoft YaHei" w:eastAsia="Microsoft YaHei"/>
+                <w:b/>
+                <w:color w:val="172233"/>
+                <w:sz w:val="18"/>
+              </w:rPr>
+              <w:t>低质量段处理</w:t>
+            </w:r>
+          </w:p>
+        </w:tc>
+        <w:tc>
+          <w:tcPr>
+            <w:tcW w:type="dxa" w:w="8352"/>
+            <w:tcBorders>
+              <w:top w:val="single" w:sz="8" w:space="0" w:color="D4DEE9"/>
+              <w:left w:val="single" w:sz="8" w:space="0" w:color="D4DEE9"/>
+              <w:bottom w:val="single" w:sz="8" w:space="0" w:color="D4DEE9"/>
+              <w:right w:val="single" w:sz="8" w:space="0" w:color="D4DEE9"/>
+              <w:insideH w:val="single" w:sz="8" w:space="0" w:color="D4DEE9"/>
+              <w:insideV w:val="single" w:sz="8" w:space="0" w:color="D4DEE9"/>
+            </w:tcBorders>
+            <w:tcMar>
+              <w:top w:w="100" w:type="dxa"/>
+              <w:start w:w="140" w:type="dxa"/>
+              <w:bottom w:w="100" w:type="dxa"/>
+              <w:end w:w="140" w:type="dxa"/>
+            </w:tcMar>
+            <w:shd w:fill="F7FAFC"/>
+            <w:vAlign w:val="center"/>
+          </w:tcPr>
+          <w:p>
+            <w:pPr>
+              <w:spacing w:after="0" w:line="264" w:lineRule="auto"/>
+            </w:pPr>
+            <w:r>
+              <w:rPr>
+                <w:rFonts w:ascii="Microsoft YaHei" w:hAnsi="Microsoft YaHei" w:eastAsia="Microsoft YaHei"/>
+                <w:b w:val="0"/>
+                <w:color w:val="172233"/>
+                <w:sz w:val="18"/>
+              </w:rPr>
+              <w:t>最终段遇到空结果、短片段或弱质量信号时，同一个 1.7B 清空上文重试一次；pipeline_metrics 保存重试、替换、失败和 VAD/分段诊断。</w:t>
+            </w:r>
+          </w:p>
+        </w:tc>
+      </w:tr>
     </w:tbl>
     <w:tbl>
       <w:tblPr>
@@ -6102,6 +7212,28 @@
           <w:rFonts w:ascii="Microsoft YaHei" w:hAnsi="Microsoft YaHei" w:eastAsia="Microsoft YaHei"/>
         </w:rPr>
         <w:t>浅色/深色主题、设置单页、弹窗外部取消不保存、模型选择文案和输入文字可读性。</w:t>
+      </w:r>
+    </w:p>
+    <w:p>
+      <w:pPr>
+        <w:pStyle w:val="a0"/>
+      </w:pPr>
+      <w:r>
+        <w:rPr>
+          <w:rFonts w:ascii="Microsoft YaHei" w:hAnsi="Microsoft YaHei" w:eastAsia="Microsoft YaHei"/>
+        </w:rPr>
+        <w:t>制造业月会实时回放：以 tests/fixtures/manufacturing_role_meeting_v3/ 的 manuscript.jsonl 对照段落、语言/方言类别、翻译状态，并确认 summary 与 todo 两次 API 请求均有结果。</w:t>
+      </w:r>
+    </w:p>
+    <w:p>
+      <w:pPr>
+        <w:pStyle w:val="a0"/>
+      </w:pPr>
+      <w:r>
+        <w:rPr>
+          <w:rFonts w:ascii="Microsoft YaHei" w:hAnsi="Microsoft YaHei" w:eastAsia="Microsoft YaHei"/>
+        </w:rPr>
+        <w:t>内部四川方言 WSC-Eval-ASR Easy 50 条回放：低质量段二次识别后覆盖率由 96% 提升到 98%，字符准确率由 82.38% 提升到 89.05%；该结果仅代表当前评测样本，不构成产品 SLA。</w:t>
       </w:r>
     </w:p>
     <w:p>

</xml_diff>